<commit_message>
subida actulización de archivos scrum
</commit_message>
<xml_diff>
--- a/Fase_2/Evidencias_Proyecto/Documentos_Scrum/Documento Product Backlog y Sprint Backlog 1.docx
+++ b/Fase_2/Evidencias_Proyecto/Documentos_Scrum/Documento Product Backlog y Sprint Backlog 1.docx
@@ -1,6 +1,6 @@
 
 <file path=word/document.xml><?xml version="1.0" encoding="utf-8"?>
-<w:document xmlns:mc="http://schemas.openxmlformats.org/markup-compatibility/2006" xmlns:o="urn:schemas-microsoft-com:office:office" xmlns:r="http://schemas.openxmlformats.org/officeDocument/2006/relationships" xmlns:m="http://schemas.openxmlformats.org/officeDocument/2006/math" xmlns:v="urn:schemas-microsoft-com:vml" xmlns:wp="http://schemas.openxmlformats.org/drawingml/2006/wordprocessingDrawing" xmlns:w10="urn:schemas-microsoft-com:office:word" xmlns:w="http://schemas.openxmlformats.org/wordprocessingml/2006/main" xmlns:wne="http://schemas.microsoft.com/office/word/2006/wordml" xmlns:sl="http://schemas.openxmlformats.org/schemaLibrary/2006/main" xmlns:a="http://schemas.openxmlformats.org/drawingml/2006/main" xmlns:pic="http://schemas.openxmlformats.org/drawingml/2006/picture" xmlns:c="http://schemas.openxmlformats.org/drawingml/2006/chart" xmlns:lc="http://schemas.openxmlformats.org/drawingml/2006/lockedCanvas" xmlns:dgm="http://schemas.openxmlformats.org/drawingml/2006/diagram" xmlns:wps="http://schemas.microsoft.com/office/word/2010/wordprocessingShape" xmlns:wpg="http://schemas.microsoft.com/office/word/2010/wordprocessingGroup" xmlns:w14="http://schemas.microsoft.com/office/word/2010/wordml" xmlns:w15="http://schemas.microsoft.com/office/word/2012/wordml">
+<w:document xmlns:mc="http://schemas.openxmlformats.org/markup-compatibility/2006" xmlns:o="urn:schemas-microsoft-com:office:office" xmlns:r="http://schemas.openxmlformats.org/officeDocument/2006/relationships" xmlns:m="http://schemas.openxmlformats.org/officeDocument/2006/math" xmlns:v="urn:schemas-microsoft-com:vml" xmlns:wp="http://schemas.openxmlformats.org/drawingml/2006/wordprocessingDrawing" xmlns:w10="urn:schemas-microsoft-com:office:word" xmlns:w="http://schemas.openxmlformats.org/wordprocessingml/2006/main" xmlns:wne="http://schemas.microsoft.com/office/word/2006/wordml" xmlns:sl="http://schemas.openxmlformats.org/schemaLibrary/2006/main" xmlns:a="http://schemas.openxmlformats.org/drawingml/2006/main" xmlns:pic="http://schemas.openxmlformats.org/drawingml/2006/picture" xmlns:c="http://schemas.openxmlformats.org/drawingml/2006/chart" xmlns:lc="http://schemas.openxmlformats.org/drawingml/2006/lockedCanvas" xmlns:dgm="http://schemas.openxmlformats.org/drawingml/2006/diagram" xmlns:wps="http://schemas.microsoft.com/office/word/2010/wordprocessingShape" xmlns:wpg="http://schemas.microsoft.com/office/word/2010/wordprocessingGroup" xmlns:w14="http://schemas.microsoft.com/office/word/2010/wordml" xmlns:w15="http://schemas.microsoft.com/office/word/2012/wordml" xmlns:w16="http://schemas.microsoft.com/office/word/2018/wordml" xmlns:w16cex="http://schemas.microsoft.com/office/word/2018/wordml/cex" xmlns:w16cid="http://schemas.microsoft.com/office/word/2016/wordml/cid" xmlns="http://schemas.microsoft.com/office/tasks/2019/documenttasks" xmlns:cr="http://schemas.microsoft.com/office/comments/2020/reactions">
   <w:body>
     <w:p>
       <w:pPr>
@@ -8,6 +8,7 @@
         <w:jc w:val="center"/>
         <w:rPr>
           <w:b w:val="1"/>
+          <w:bCs w:val="1"/>
           <w:sz w:val="36"/>
           <w:szCs w:val="36"/>
         </w:rPr>
@@ -26,6 +27,7 @@
         <w:jc w:val="center"/>
         <w:rPr>
           <w:b w:val="1"/>
+          <w:bCs w:val="1"/>
           <w:sz w:val="36"/>
           <w:szCs w:val="36"/>
         </w:rPr>
@@ -44,6 +46,7 @@
         <w:jc w:val="center"/>
         <w:rPr>
           <w:b w:val="1"/>
+          <w:bCs w:val="1"/>
           <w:color w:val="000000"/>
           <w:sz w:val="36"/>
           <w:szCs w:val="36"/>
@@ -61,6 +64,7 @@
         <w:jc w:val="center"/>
         <w:rPr>
           <w:b w:val="1"/>
+          <w:bCs w:val="1"/>
           <w:color w:val="000000"/>
           <w:sz w:val="36"/>
           <w:szCs w:val="36"/>
@@ -78,6 +82,7 @@
         <w:jc w:val="center"/>
         <w:rPr>
           <w:b w:val="1"/>
+          <w:bCs w:val="1"/>
           <w:color w:val="000000"/>
           <w:sz w:val="36"/>
           <w:szCs w:val="36"/>
@@ -95,6 +100,7 @@
         <w:jc w:val="center"/>
         <w:rPr>
           <w:b w:val="1"/>
+          <w:bCs w:val="1"/>
           <w:color w:val="000000"/>
           <w:sz w:val="36"/>
           <w:szCs w:val="36"/>
@@ -112,6 +118,7 @@
         <w:jc w:val="center"/>
         <w:rPr>
           <w:b w:val="1"/>
+          <w:bCs w:val="1"/>
           <w:color w:val="000000"/>
           <w:sz w:val="36"/>
           <w:szCs w:val="36"/>
@@ -129,6 +136,7 @@
         <w:jc w:val="center"/>
         <w:rPr>
           <w:b w:val="1"/>
+          <w:bCs w:val="1"/>
           <w:color w:val="000000"/>
           <w:sz w:val="36"/>
           <w:szCs w:val="36"/>
@@ -146,6 +154,7 @@
         <w:jc w:val="center"/>
         <w:rPr>
           <w:b w:val="1"/>
+          <w:bCs w:val="1"/>
           <w:color w:val="000000"/>
           <w:sz w:val="36"/>
           <w:szCs w:val="36"/>
@@ -163,6 +172,7 @@
         <w:jc w:val="center"/>
         <w:rPr>
           <w:b w:val="1"/>
+          <w:bCs w:val="1"/>
           <w:color w:val="000000"/>
           <w:sz w:val="36"/>
           <w:szCs w:val="36"/>
@@ -180,6 +190,7 @@
         <w:jc w:val="center"/>
         <w:rPr>
           <w:b w:val="1"/>
+          <w:bCs w:val="1"/>
           <w:color w:val="000000"/>
           <w:sz w:val="36"/>
           <w:szCs w:val="36"/>
@@ -197,6 +208,7 @@
         <w:jc w:val="right"/>
         <w:rPr>
           <w:b w:val="1"/>
+          <w:bCs w:val="1"/>
           <w:color w:val="000000"/>
           <w:sz w:val="48"/>
           <w:szCs w:val="48"/>
@@ -205,6 +217,7 @@
       <w:r>
         <w:rPr>
           <w:b w:val="1"/>
+          <w:bCs w:val="1"/>
           <w:color w:val="000000"/>
           <w:sz w:val="48"/>
           <w:szCs w:val="48"/>
@@ -219,6 +232,7 @@
         <w:jc w:val="right"/>
         <w:rPr>
           <w:b w:val="1"/>
+          <w:bCs w:val="1"/>
           <w:color w:val="000000"/>
           <w:sz w:val="48"/>
           <w:szCs w:val="48"/>
@@ -227,6 +241,7 @@
       <w:r>
         <w:rPr>
           <w:b w:val="1"/>
+          <w:bCs w:val="1"/>
           <w:color w:val="000000"/>
           <w:sz w:val="48"/>
           <w:szCs w:val="48"/>
@@ -241,6 +256,7 @@
         <w:jc w:val="right"/>
         <w:rPr>
           <w:b w:val="1"/>
+          <w:bCs w:val="1"/>
           <w:color w:val="000000"/>
           <w:sz w:val="48"/>
           <w:szCs w:val="48"/>
@@ -249,12 +265,34 @@
       <w:r>
         <w:rPr>
           <w:b w:val="1"/>
+          <w:bCs w:val="1"/>
           <w:color w:val="000000"/>
           <w:sz w:val="48"/>
           <w:szCs w:val="48"/>
           <w:rtl w:val="0"/>
         </w:rPr>
-        <w:t xml:space="preserve"> “Nombre Proyecto”</w:t>
+        <w:t xml:space="preserve"> “</w:t>
+      </w:r>
+      <w:r>
+        <w:rPr>
+          <w:b w:val="1"/>
+          <w:bCs w:val="1"/>
+          <w:sz w:val="48"/>
+          <w:szCs w:val="48"/>
+          <w:rtl w:val="0"/>
+        </w:rPr>
+        <w:t xml:space="preserve">HomeCountSimulator</w:t>
+      </w:r>
+      <w:r>
+        <w:rPr>
+          <w:b w:val="1"/>
+          <w:bCs w:val="1"/>
+          <w:color w:val="000000"/>
+          <w:sz w:val="48"/>
+          <w:szCs w:val="48"/>
+          <w:rtl w:val="0"/>
+        </w:rPr>
+        <w:t xml:space="preserve">”</w:t>
       </w:r>
     </w:p>
     <w:p>
@@ -263,7 +301,9 @@
         <w:jc w:val="right"/>
         <w:rPr>
           <w:b w:val="1"/>
+          <w:bCs w:val="1"/>
           <w:i w:val="1"/>
+          <w:iCs w:val="1"/>
           <w:color w:val="00b050"/>
           <w:sz w:val="36"/>
           <w:szCs w:val="36"/>
@@ -271,20 +311,16 @@
       </w:pPr>
       <w:r>
         <w:rPr>
-          <w:rFonts w:ascii="Calibri" w:cs="Calibri" w:eastAsia="Calibri" w:hAnsi="Calibri"/>
-          <w:b w:val="1"/>
+          <w:b w:val="1"/>
+          <w:bCs w:val="1"/>
           <w:i w:val="1"/>
+          <w:iCs w:val="1"/>
           <w:color w:val="00b050"/>
           <w:sz w:val="36"/>
           <w:szCs w:val="36"/>
           <w:rtl w:val="0"/>
         </w:rPr>
-        <w:t xml:space="preserve">[Siglas del Proyecto]</w:t>
-      </w:r>
-      <w:r>
-        <w:rPr>
-          <w:rtl w:val="0"/>
-        </w:rPr>
+        <w:t xml:space="preserve">HCS</w:t>
       </w:r>
     </w:p>
     <w:p>
@@ -294,7 +330,9 @@
         <w:rPr>
           <w:rFonts w:ascii="Calibri" w:cs="Calibri" w:eastAsia="Calibri" w:hAnsi="Calibri"/>
           <w:b w:val="1"/>
+          <w:bCs w:val="1"/>
           <w:i w:val="1"/>
+          <w:iCs w:val="1"/>
           <w:color w:val="365f91"/>
           <w:sz w:val="36"/>
           <w:szCs w:val="36"/>
@@ -303,7 +341,9 @@
       <w:r>
         <w:rPr>
           <w:b w:val="1"/>
+          <w:bCs w:val="1"/>
           <w:i w:val="1"/>
+          <w:iCs w:val="1"/>
           <w:sz w:val="36"/>
           <w:szCs w:val="36"/>
           <w:rtl w:val="0"/>
@@ -313,13 +353,15 @@
       <w:r>
         <w:rPr>
           <w:b w:val="1"/>
+          <w:bCs w:val="1"/>
           <w:i w:val="1"/>
+          <w:iCs w:val="1"/>
           <w:color w:val="00b050"/>
           <w:sz w:val="36"/>
           <w:szCs w:val="36"/>
           <w:rtl w:val="0"/>
         </w:rPr>
-        <w:t xml:space="preserve">[dd/mm/aaa]</w:t>
+        <w:t xml:space="preserve">[07/09/2026]</w:t>
       </w:r>
       <w:r>
         <w:rPr>
@@ -332,6 +374,7 @@
         <w:spacing w:after="0" w:line="240" w:lineRule="auto"/>
         <w:rPr>
           <w:b w:val="1"/>
+          <w:bCs w:val="1"/>
           <w:color w:val="365f91"/>
         </w:rPr>
       </w:pPr>
@@ -346,6 +389,7 @@
         <w:spacing w:after="0" w:line="240" w:lineRule="auto"/>
         <w:rPr>
           <w:b w:val="1"/>
+          <w:bCs w:val="1"/>
           <w:color w:val="365f91"/>
         </w:rPr>
       </w:pPr>
@@ -360,6 +404,7 @@
         <w:spacing w:after="0" w:line="240" w:lineRule="auto"/>
         <w:rPr>
           <w:b w:val="1"/>
+          <w:bCs w:val="1"/>
           <w:color w:val="365f91"/>
         </w:rPr>
       </w:pPr>
@@ -374,6 +419,7 @@
         <w:spacing w:after="0" w:line="240" w:lineRule="auto"/>
         <w:rPr>
           <w:b w:val="1"/>
+          <w:bCs w:val="1"/>
           <w:color w:val="365f91"/>
         </w:rPr>
       </w:pPr>
@@ -388,6 +434,7 @@
         <w:spacing w:after="0" w:line="240" w:lineRule="auto"/>
         <w:rPr>
           <w:b w:val="1"/>
+          <w:bCs w:val="1"/>
           <w:color w:val="365f91"/>
         </w:rPr>
       </w:pPr>
@@ -402,6 +449,7 @@
         <w:spacing w:after="0" w:line="240" w:lineRule="auto"/>
         <w:rPr>
           <w:b w:val="1"/>
+          <w:bCs w:val="1"/>
           <w:color w:val="365f91"/>
         </w:rPr>
       </w:pPr>
@@ -416,6 +464,7 @@
         <w:spacing w:after="0" w:line="240" w:lineRule="auto"/>
         <w:rPr>
           <w:b w:val="1"/>
+          <w:bCs w:val="1"/>
           <w:color w:val="365f91"/>
         </w:rPr>
       </w:pPr>
@@ -430,6 +479,7 @@
         <w:spacing w:after="0" w:line="240" w:lineRule="auto"/>
         <w:rPr>
           <w:b w:val="1"/>
+          <w:bCs w:val="1"/>
           <w:color w:val="365f91"/>
         </w:rPr>
       </w:pPr>
@@ -444,6 +494,7 @@
         <w:spacing w:after="0" w:line="240" w:lineRule="auto"/>
         <w:rPr>
           <w:b w:val="1"/>
+          <w:bCs w:val="1"/>
           <w:color w:val="365f91"/>
         </w:rPr>
       </w:pPr>
@@ -458,6 +509,7 @@
         <w:spacing w:after="0" w:line="240" w:lineRule="auto"/>
         <w:rPr>
           <w:b w:val="1"/>
+          <w:bCs w:val="1"/>
           <w:color w:val="365f91"/>
         </w:rPr>
       </w:pPr>
@@ -472,6 +524,7 @@
         <w:spacing w:after="0" w:line="240" w:lineRule="auto"/>
         <w:rPr>
           <w:b w:val="1"/>
+          <w:bCs w:val="1"/>
           <w:color w:val="365f91"/>
         </w:rPr>
       </w:pPr>
@@ -486,6 +539,7 @@
         <w:spacing w:after="0" w:line="240" w:lineRule="auto"/>
         <w:rPr>
           <w:b w:val="1"/>
+          <w:bCs w:val="1"/>
           <w:color w:val="365f91"/>
         </w:rPr>
       </w:pPr>
@@ -500,6 +554,7 @@
         <w:spacing w:after="0" w:line="240" w:lineRule="auto"/>
         <w:rPr>
           <w:b w:val="1"/>
+          <w:bCs w:val="1"/>
           <w:color w:val="365f91"/>
         </w:rPr>
       </w:pPr>
@@ -514,6 +569,7 @@
         <w:spacing w:after="0" w:line="240" w:lineRule="auto"/>
         <w:rPr>
           <w:b w:val="1"/>
+          <w:bCs w:val="1"/>
           <w:color w:val="365f91"/>
         </w:rPr>
       </w:pPr>
@@ -528,6 +584,7 @@
         <w:spacing w:after="0" w:line="240" w:lineRule="auto"/>
         <w:rPr>
           <w:b w:val="1"/>
+          <w:bCs w:val="1"/>
           <w:color w:val="365f91"/>
         </w:rPr>
       </w:pPr>
@@ -542,6 +599,7 @@
         <w:spacing w:after="0" w:line="240" w:lineRule="auto"/>
         <w:rPr>
           <w:b w:val="1"/>
+          <w:bCs w:val="1"/>
           <w:color w:val="365f91"/>
         </w:rPr>
       </w:pPr>
@@ -556,6 +614,7 @@
         <w:spacing w:after="0" w:line="240" w:lineRule="auto"/>
         <w:rPr>
           <w:b w:val="1"/>
+          <w:bCs w:val="1"/>
           <w:color w:val="365f91"/>
         </w:rPr>
       </w:pPr>
@@ -570,6 +629,7 @@
         <w:spacing w:after="0" w:line="240" w:lineRule="auto"/>
         <w:rPr>
           <w:b w:val="1"/>
+          <w:bCs w:val="1"/>
           <w:color w:val="365f91"/>
         </w:rPr>
       </w:pPr>
@@ -584,6 +644,21 @@
         <w:spacing w:after="0" w:line="240" w:lineRule="auto"/>
         <w:rPr>
           <w:b w:val="1"/>
+          <w:bCs w:val="1"/>
+          <w:color w:val="365f91"/>
+        </w:rPr>
+      </w:pPr>
+      <w:r>
+        <w:rPr>
+          <w:rtl w:val="0"/>
+        </w:rPr>
+      </w:r>
+    </w:p>
+    <w:p>
+      <w:pPr>
+        <w:rPr>
+          <w:b w:val="1"/>
+          <w:bCs w:val="1"/>
           <w:color w:val="365f91"/>
         </w:rPr>
       </w:pPr>
@@ -598,6 +673,7 @@
         <w:spacing w:after="0" w:line="240" w:lineRule="auto"/>
         <w:rPr>
           <w:b w:val="1"/>
+          <w:bCs w:val="1"/>
           <w:color w:val="365f91"/>
         </w:rPr>
       </w:pPr>
@@ -611,50 +687,6 @@
       <w:pPr>
         <w:spacing w:after="0" w:line="240" w:lineRule="auto"/>
         <w:rPr>
-          <w:b w:val="1"/>
-          <w:color w:val="365f91"/>
-        </w:rPr>
-      </w:pPr>
-      <w:r>
-        <w:rPr>
-          <w:rtl w:val="0"/>
-        </w:rPr>
-      </w:r>
-    </w:p>
-    <w:p>
-      <w:pPr>
-        <w:rPr>
-          <w:b w:val="1"/>
-          <w:color w:val="365f91"/>
-        </w:rPr>
-      </w:pPr>
-      <w:r>
-        <w:br w:type="page"/>
-      </w:r>
-      <w:r>
-        <w:rPr>
-          <w:rtl w:val="0"/>
-        </w:rPr>
-      </w:r>
-    </w:p>
-    <w:p>
-      <w:pPr>
-        <w:spacing w:after="0" w:line="240" w:lineRule="auto"/>
-        <w:rPr>
-          <w:b w:val="1"/>
-          <w:color w:val="365f91"/>
-        </w:rPr>
-      </w:pPr>
-      <w:r>
-        <w:rPr>
-          <w:rtl w:val="0"/>
-        </w:rPr>
-      </w:r>
-    </w:p>
-    <w:p>
-      <w:pPr>
-        <w:spacing w:after="0" w:line="240" w:lineRule="auto"/>
-        <w:rPr>
           <w:color w:val="000000"/>
           <w:sz w:val="24"/>
           <w:szCs w:val="24"/>
@@ -665,6 +697,7 @@
       <w:r>
         <w:rPr>
           <w:b w:val="1"/>
+          <w:bCs w:val="1"/>
           <w:color w:val="365f91"/>
           <w:sz w:val="32"/>
           <w:szCs w:val="32"/>
@@ -712,7 +745,9 @@
         <w:rPr>
           <w:rFonts w:ascii="Cambria" w:cs="Cambria" w:eastAsia="Cambria" w:hAnsi="Cambria"/>
           <w:b w:val="1"/>
+          <w:bCs w:val="1"/>
           <w:i w:val="0"/>
+          <w:iCs w:val="0"/>
           <w:smallCaps w:val="0"/>
           <w:strike w:val="0"/>
           <w:color w:val="366091"/>
@@ -727,7 +762,9 @@
         <w:rPr>
           <w:rFonts w:ascii="Cambria" w:cs="Cambria" w:eastAsia="Cambria" w:hAnsi="Cambria"/>
           <w:b w:val="1"/>
+          <w:bCs w:val="1"/>
           <w:i w:val="0"/>
+          <w:iCs w:val="0"/>
           <w:smallCaps w:val="0"/>
           <w:strike w:val="0"/>
           <w:color w:val="366091"/>
@@ -743,6 +780,7 @@
     </w:p>
     <w:sdt>
       <w:sdtPr>
+        <w:id w:val="1530612044"/>
         <w:docPartObj>
           <w:docPartGallery w:val="Table of Contents"/>
           <w:docPartUnique w:val="1"/>
@@ -764,7 +802,7 @@
             </w:pBdr>
             <w:shd w:fill="auto" w:val="clear"/>
             <w:tabs>
-              <w:tab w:val="right" w:pos="8828"/>
+              <w:tab w:val="right" w:leader="none" w:pos="8828"/>
             </w:tabs>
             <w:spacing w:after="100" w:before="0" w:line="276" w:lineRule="auto"/>
             <w:ind w:left="0" w:right="0" w:firstLine="0"/>
@@ -772,7 +810,9 @@
             <w:rPr>
               <w:rFonts w:ascii="Calibri" w:cs="Calibri" w:eastAsia="Calibri" w:hAnsi="Calibri"/>
               <w:b w:val="0"/>
+              <w:bCs w:val="0"/>
               <w:i w:val="0"/>
+              <w:iCs w:val="0"/>
               <w:smallCaps w:val="0"/>
               <w:strike w:val="0"/>
               <w:color w:val="000000"/>
@@ -785,7 +825,7 @@
           </w:pPr>
           <w:r>
             <w:fldChar w:fldCharType="begin"/>
-            <w:instrText xml:space="preserve"> TOC \h \u \z </w:instrText>
+            <w:instrText xml:space="preserve"> TOC \h \u \z \t "Heading 1,1,Heading 2,2,Heading 3,3,Heading 4,4,Heading 5,5,Heading 6,6,"</w:instrText>
             <w:fldChar w:fldCharType="separate"/>
           </w:r>
           <w:hyperlink w:anchor="_heading=h.1fob9te">
@@ -793,7 +833,9 @@
               <w:rPr>
                 <w:rFonts w:ascii="Calibri" w:cs="Calibri" w:eastAsia="Calibri" w:hAnsi="Calibri"/>
                 <w:b w:val="0"/>
+                <w:bCs w:val="0"/>
                 <w:i w:val="0"/>
+                <w:iCs w:val="0"/>
                 <w:smallCaps w:val="0"/>
                 <w:strike w:val="0"/>
                 <w:color w:val="000000"/>
@@ -830,7 +872,7 @@
             </w:pBdr>
             <w:shd w:fill="auto" w:val="clear"/>
             <w:tabs>
-              <w:tab w:val="right" w:pos="8828"/>
+              <w:tab w:val="right" w:leader="none" w:pos="8828"/>
             </w:tabs>
             <w:spacing w:after="100" w:before="0" w:line="276" w:lineRule="auto"/>
             <w:ind w:left="0" w:right="0" w:firstLine="0"/>
@@ -838,7 +880,9 @@
             <w:rPr>
               <w:rFonts w:ascii="Calibri" w:cs="Calibri" w:eastAsia="Calibri" w:hAnsi="Calibri"/>
               <w:b w:val="0"/>
+              <w:bCs w:val="0"/>
               <w:i w:val="0"/>
+              <w:iCs w:val="0"/>
               <w:smallCaps w:val="0"/>
               <w:strike w:val="0"/>
               <w:color w:val="000000"/>
@@ -854,7 +898,9 @@
               <w:rPr>
                 <w:rFonts w:ascii="Calibri" w:cs="Calibri" w:eastAsia="Calibri" w:hAnsi="Calibri"/>
                 <w:b w:val="0"/>
+                <w:bCs w:val="0"/>
                 <w:i w:val="0"/>
+                <w:iCs w:val="0"/>
                 <w:smallCaps w:val="0"/>
                 <w:strike w:val="0"/>
                 <w:color w:val="000000"/>
@@ -891,7 +937,7 @@
             </w:pBdr>
             <w:shd w:fill="auto" w:val="clear"/>
             <w:tabs>
-              <w:tab w:val="right" w:pos="8828"/>
+              <w:tab w:val="right" w:leader="none" w:pos="8828"/>
             </w:tabs>
             <w:spacing w:after="100" w:before="0" w:line="276" w:lineRule="auto"/>
             <w:ind w:left="220" w:right="0" w:firstLine="0"/>
@@ -899,7 +945,9 @@
             <w:rPr>
               <w:rFonts w:ascii="Calibri" w:cs="Calibri" w:eastAsia="Calibri" w:hAnsi="Calibri"/>
               <w:b w:val="0"/>
+              <w:bCs w:val="0"/>
               <w:i w:val="0"/>
+              <w:iCs w:val="0"/>
               <w:smallCaps w:val="0"/>
               <w:strike w:val="0"/>
               <w:color w:val="000000"/>
@@ -915,7 +963,9 @@
               <w:rPr>
                 <w:rFonts w:ascii="Calibri" w:cs="Calibri" w:eastAsia="Calibri" w:hAnsi="Calibri"/>
                 <w:b w:val="0"/>
+                <w:bCs w:val="0"/>
                 <w:i w:val="0"/>
+                <w:iCs w:val="0"/>
                 <w:smallCaps w:val="0"/>
                 <w:strike w:val="0"/>
                 <w:color w:val="000000"/>
@@ -952,7 +1002,7 @@
             </w:pBdr>
             <w:shd w:fill="auto" w:val="clear"/>
             <w:tabs>
-              <w:tab w:val="right" w:pos="8828"/>
+              <w:tab w:val="right" w:leader="none" w:pos="8828"/>
             </w:tabs>
             <w:spacing w:after="100" w:before="0" w:line="276" w:lineRule="auto"/>
             <w:ind w:left="220" w:right="0" w:firstLine="0"/>
@@ -960,7 +1010,9 @@
             <w:rPr>
               <w:rFonts w:ascii="Calibri" w:cs="Calibri" w:eastAsia="Calibri" w:hAnsi="Calibri"/>
               <w:b w:val="0"/>
+              <w:bCs w:val="0"/>
               <w:i w:val="0"/>
+              <w:iCs w:val="0"/>
               <w:smallCaps w:val="0"/>
               <w:strike w:val="0"/>
               <w:color w:val="000000"/>
@@ -976,7 +1028,9 @@
               <w:rPr>
                 <w:rFonts w:ascii="Calibri" w:cs="Calibri" w:eastAsia="Calibri" w:hAnsi="Calibri"/>
                 <w:b w:val="0"/>
+                <w:bCs w:val="0"/>
                 <w:i w:val="0"/>
+                <w:iCs w:val="0"/>
                 <w:smallCaps w:val="0"/>
                 <w:strike w:val="0"/>
                 <w:color w:val="000000"/>
@@ -1013,7 +1067,7 @@
             </w:pBdr>
             <w:shd w:fill="auto" w:val="clear"/>
             <w:tabs>
-              <w:tab w:val="right" w:pos="8828"/>
+              <w:tab w:val="right" w:leader="none" w:pos="8828"/>
             </w:tabs>
             <w:spacing w:after="100" w:before="0" w:line="276" w:lineRule="auto"/>
             <w:ind w:left="0" w:right="0" w:firstLine="0"/>
@@ -1021,7 +1075,9 @@
             <w:rPr>
               <w:rFonts w:ascii="Calibri" w:cs="Calibri" w:eastAsia="Calibri" w:hAnsi="Calibri"/>
               <w:b w:val="0"/>
+              <w:bCs w:val="0"/>
               <w:i w:val="0"/>
+              <w:iCs w:val="0"/>
               <w:smallCaps w:val="0"/>
               <w:strike w:val="0"/>
               <w:color w:val="000000"/>
@@ -1037,7 +1093,9 @@
               <w:rPr>
                 <w:rFonts w:ascii="Calibri" w:cs="Calibri" w:eastAsia="Calibri" w:hAnsi="Calibri"/>
                 <w:b w:val="0"/>
+                <w:bCs w:val="0"/>
                 <w:i w:val="0"/>
+                <w:iCs w:val="0"/>
                 <w:smallCaps w:val="0"/>
                 <w:strike w:val="0"/>
                 <w:color w:val="000000"/>
@@ -1074,7 +1132,7 @@
             </w:pBdr>
             <w:shd w:fill="auto" w:val="clear"/>
             <w:tabs>
-              <w:tab w:val="right" w:pos="8828"/>
+              <w:tab w:val="right" w:leader="none" w:pos="8828"/>
             </w:tabs>
             <w:spacing w:after="100" w:before="0" w:line="276" w:lineRule="auto"/>
             <w:ind w:left="0" w:right="0" w:firstLine="0"/>
@@ -1082,7 +1140,9 @@
             <w:rPr>
               <w:rFonts w:ascii="Calibri" w:cs="Calibri" w:eastAsia="Calibri" w:hAnsi="Calibri"/>
               <w:b w:val="0"/>
+              <w:bCs w:val="0"/>
               <w:i w:val="0"/>
+              <w:iCs w:val="0"/>
               <w:smallCaps w:val="0"/>
               <w:strike w:val="0"/>
               <w:color w:val="000000"/>
@@ -1098,7 +1158,9 @@
               <w:rPr>
                 <w:rFonts w:ascii="Calibri" w:cs="Calibri" w:eastAsia="Calibri" w:hAnsi="Calibri"/>
                 <w:b w:val="0"/>
+                <w:bCs w:val="0"/>
                 <w:i w:val="0"/>
+                <w:iCs w:val="0"/>
                 <w:smallCaps w:val="0"/>
                 <w:strike w:val="0"/>
                 <w:color w:val="000000"/>
@@ -1135,7 +1197,7 @@
             </w:pBdr>
             <w:shd w:fill="auto" w:val="clear"/>
             <w:tabs>
-              <w:tab w:val="right" w:pos="8828"/>
+              <w:tab w:val="right" w:leader="none" w:pos="8828"/>
             </w:tabs>
             <w:spacing w:after="100" w:before="0" w:line="276" w:lineRule="auto"/>
             <w:ind w:left="0" w:right="0" w:firstLine="0"/>
@@ -1143,7 +1205,9 @@
             <w:rPr>
               <w:rFonts w:ascii="Calibri" w:cs="Calibri" w:eastAsia="Calibri" w:hAnsi="Calibri"/>
               <w:b w:val="0"/>
+              <w:bCs w:val="0"/>
               <w:i w:val="0"/>
+              <w:iCs w:val="0"/>
               <w:smallCaps w:val="0"/>
               <w:strike w:val="0"/>
               <w:color w:val="000000"/>
@@ -1159,7 +1223,9 @@
               <w:rPr>
                 <w:rFonts w:ascii="Calibri" w:cs="Calibri" w:eastAsia="Calibri" w:hAnsi="Calibri"/>
                 <w:b w:val="0"/>
+                <w:bCs w:val="0"/>
                 <w:i w:val="0"/>
+                <w:iCs w:val="0"/>
                 <w:smallCaps w:val="0"/>
                 <w:strike w:val="0"/>
                 <w:color w:val="000000"/>
@@ -1201,32 +1267,49 @@
         <w:rPr>
           <w:rFonts w:ascii="Cambria" w:cs="Cambria" w:eastAsia="Cambria" w:hAnsi="Cambria"/>
           <w:b w:val="1"/>
+          <w:bCs w:val="1"/>
+          <w:i w:val="0"/>
+          <w:iCs w:val="0"/>
+          <w:smallCaps w:val="0"/>
+          <w:strike w:val="0"/>
           <w:color w:val="366091"/>
           <w:sz w:val="28"/>
           <w:szCs w:val="28"/>
+          <w:u w:val="none"/>
+          <w:shd w:fill="auto" w:val="clear"/>
+          <w:vertAlign w:val="baseline"/>
         </w:rPr>
       </w:pPr>
       <w:r>
-        <w:br w:type="page"/>
-      </w:r>
-      <w:r>
-        <w:rPr>
-          <w:rtl w:val="0"/>
-        </w:rPr>
-      </w:r>
-    </w:p>
-    <w:p>
-      <w:pPr>
-        <w:pStyle w:val="Heading1"/>
-        <w:rPr/>
-      </w:pPr>
-      <w:bookmarkStart w:colFirst="0" w:colLast="0" w:name="_heading=h.1fob9te" w:id="3"/>
-      <w:bookmarkEnd w:id="3"/>
-      <w:r>
-        <w:rPr>
-          <w:rtl w:val="0"/>
-        </w:rPr>
-        <w:t xml:space="preserve">Datos del documento</w:t>
+        <w:rPr>
+          <w:rFonts w:ascii="Cambria" w:cs="Cambria" w:eastAsia="Cambria" w:hAnsi="Cambria"/>
+          <w:b w:val="1"/>
+          <w:bCs w:val="1"/>
+          <w:color w:val="366091"/>
+          <w:sz w:val="28"/>
+          <w:szCs w:val="28"/>
+          <w:rtl w:val="0"/>
+        </w:rPr>
+        <w:t xml:space="preserve">Da</w:t>
+      </w:r>
+      <w:r>
+        <w:rPr>
+          <w:rFonts w:ascii="Cambria" w:cs="Cambria" w:eastAsia="Cambria" w:hAnsi="Cambria"/>
+          <w:b w:val="1"/>
+          <w:bCs w:val="1"/>
+          <w:i w:val="0"/>
+          <w:iCs w:val="0"/>
+          <w:smallCaps w:val="0"/>
+          <w:strike w:val="0"/>
+          <w:color w:val="366091"/>
+          <w:sz w:val="28"/>
+          <w:szCs w:val="28"/>
+          <w:u w:val="none"/>
+          <w:shd w:fill="auto" w:val="clear"/>
+          <w:vertAlign w:val="baseline"/>
+          <w:rtl w:val="0"/>
+        </w:rPr>
+        <w:t xml:space="preserve">tos del documento</w:t>
       </w:r>
     </w:p>
     <w:p>
@@ -1268,7 +1351,6 @@
         <w:tblStyle w:val="Table1"/>
         <w:tblW w:w="8828.0" w:type="dxa"/>
         <w:jc w:val="left"/>
-        <w:tblInd w:w="0.0" w:type="dxa"/>
         <w:tblBorders>
           <w:top w:color="000000" w:space="0" w:sz="4" w:val="single"/>
           <w:left w:color="000000" w:space="0" w:sz="4" w:val="single"/>
@@ -1304,7 +1386,7 @@
           <w:p>
             <w:pPr>
               <w:tabs>
-                <w:tab w:val="left" w:pos="1276"/>
+                <w:tab w:val="left" w:leader="none" w:pos="1276"/>
               </w:tabs>
               <w:rPr>
                 <w:color w:val="000000"/>
@@ -1328,7 +1410,7 @@
           <w:p>
             <w:pPr>
               <w:tabs>
-                <w:tab w:val="left" w:pos="1276"/>
+                <w:tab w:val="left" w:leader="none" w:pos="1276"/>
               </w:tabs>
               <w:rPr>
                 <w:color w:val="000000"/>
@@ -1352,7 +1434,7 @@
           <w:p>
             <w:pPr>
               <w:tabs>
-                <w:tab w:val="left" w:pos="1276"/>
+                <w:tab w:val="left" w:leader="none" w:pos="1276"/>
               </w:tabs>
               <w:rPr>
                 <w:color w:val="000000"/>
@@ -1376,7 +1458,7 @@
           <w:p>
             <w:pPr>
               <w:tabs>
-                <w:tab w:val="left" w:pos="1276"/>
+                <w:tab w:val="left" w:leader="none" w:pos="1276"/>
               </w:tabs>
               <w:rPr>
                 <w:color w:val="000000"/>
@@ -1406,7 +1488,7 @@
           <w:p>
             <w:pPr>
               <w:tabs>
-                <w:tab w:val="left" w:pos="1276"/>
+                <w:tab w:val="left" w:leader="none" w:pos="1276"/>
               </w:tabs>
               <w:rPr>
                 <w:color w:val="000000"/>
@@ -1416,6 +1498,14 @@
             </w:pPr>
             <w:r>
               <w:rPr>
+                <w:sz w:val="24"/>
+                <w:szCs w:val="24"/>
+                <w:rtl w:val="0"/>
+              </w:rPr>
+              <w:t xml:space="preserve">1.0</w:t>
+            </w:r>
+            <w:r>
+              <w:rPr>
                 <w:rtl w:val="0"/>
               </w:rPr>
             </w:r>
@@ -1426,7 +1516,7 @@
           <w:p>
             <w:pPr>
               <w:tabs>
-                <w:tab w:val="left" w:pos="1276"/>
+                <w:tab w:val="left" w:leader="none" w:pos="1276"/>
               </w:tabs>
               <w:rPr>
                 <w:color w:val="000000"/>
@@ -1436,6 +1526,14 @@
             </w:pPr>
             <w:r>
               <w:rPr>
+                <w:sz w:val="24"/>
+                <w:szCs w:val="24"/>
+                <w:rtl w:val="0"/>
+              </w:rPr>
+              <w:t xml:space="preserve">07/09/2026</w:t>
+            </w:r>
+            <w:r>
+              <w:rPr>
                 <w:rtl w:val="0"/>
               </w:rPr>
             </w:r>
@@ -1446,7 +1544,7 @@
           <w:p>
             <w:pPr>
               <w:tabs>
-                <w:tab w:val="left" w:pos="1276"/>
+                <w:tab w:val="left" w:leader="none" w:pos="1276"/>
               </w:tabs>
               <w:rPr>
                 <w:color w:val="000000"/>
@@ -1456,6 +1554,14 @@
             </w:pPr>
             <w:r>
               <w:rPr>
+                <w:sz w:val="24"/>
+                <w:szCs w:val="24"/>
+                <w:rtl w:val="0"/>
+              </w:rPr>
+              <w:t xml:space="preserve">Cambios iniciales al documento</w:t>
+            </w:r>
+            <w:r>
+              <w:rPr>
                 <w:rtl w:val="0"/>
               </w:rPr>
             </w:r>
@@ -1466,7 +1572,7 @@
           <w:p>
             <w:pPr>
               <w:tabs>
-                <w:tab w:val="left" w:pos="1276"/>
+                <w:tab w:val="left" w:leader="none" w:pos="1276"/>
               </w:tabs>
               <w:rPr>
                 <w:color w:val="000000"/>
@@ -1474,6 +1580,14 @@
                 <w:szCs w:val="24"/>
               </w:rPr>
             </w:pPr>
+            <w:r>
+              <w:rPr>
+                <w:sz w:val="24"/>
+                <w:szCs w:val="24"/>
+                <w:rtl w:val="0"/>
+              </w:rPr>
+              <w:t xml:space="preserve">Lucas Padilla</w:t>
+            </w:r>
             <w:r>
               <w:rPr>
                 <w:rtl w:val="0"/>
@@ -1492,7 +1606,7 @@
           <w:p>
             <w:pPr>
               <w:tabs>
-                <w:tab w:val="left" w:pos="1276"/>
+                <w:tab w:val="left" w:leader="none" w:pos="1276"/>
               </w:tabs>
               <w:rPr>
                 <w:color w:val="000000"/>
@@ -1502,6 +1616,14 @@
             </w:pPr>
             <w:r>
               <w:rPr>
+                <w:sz w:val="24"/>
+                <w:szCs w:val="24"/>
+                <w:rtl w:val="0"/>
+              </w:rPr>
+              <w:t xml:space="preserve">1.5</w:t>
+            </w:r>
+            <w:r>
+              <w:rPr>
                 <w:rtl w:val="0"/>
               </w:rPr>
             </w:r>
@@ -1512,7 +1634,7 @@
           <w:p>
             <w:pPr>
               <w:tabs>
-                <w:tab w:val="left" w:pos="1276"/>
+                <w:tab w:val="left" w:leader="none" w:pos="1276"/>
               </w:tabs>
               <w:rPr>
                 <w:color w:val="000000"/>
@@ -1522,6 +1644,14 @@
             </w:pPr>
             <w:r>
               <w:rPr>
+                <w:sz w:val="24"/>
+                <w:szCs w:val="24"/>
+                <w:rtl w:val="0"/>
+              </w:rPr>
+              <w:t xml:space="preserve">12/09/2026</w:t>
+            </w:r>
+            <w:r>
+              <w:rPr>
                 <w:rtl w:val="0"/>
               </w:rPr>
             </w:r>
@@ -1532,7 +1662,7 @@
           <w:p>
             <w:pPr>
               <w:tabs>
-                <w:tab w:val="left" w:pos="1276"/>
+                <w:tab w:val="left" w:leader="none" w:pos="1276"/>
               </w:tabs>
               <w:rPr>
                 <w:color w:val="000000"/>
@@ -1542,6 +1672,14 @@
             </w:pPr>
             <w:r>
               <w:rPr>
+                <w:sz w:val="24"/>
+                <w:szCs w:val="24"/>
+                <w:rtl w:val="0"/>
+              </w:rPr>
+              <w:t xml:space="preserve">Finalización del documento</w:t>
+            </w:r>
+            <w:r>
+              <w:rPr>
                 <w:rtl w:val="0"/>
               </w:rPr>
             </w:r>
@@ -1552,7 +1690,7 @@
           <w:p>
             <w:pPr>
               <w:tabs>
-                <w:tab w:val="left" w:pos="1276"/>
+                <w:tab w:val="left" w:leader="none" w:pos="1276"/>
               </w:tabs>
               <w:rPr>
                 <w:color w:val="000000"/>
@@ -1560,6 +1698,14 @@
                 <w:szCs w:val="24"/>
               </w:rPr>
             </w:pPr>
+            <w:r>
+              <w:rPr>
+                <w:sz w:val="24"/>
+                <w:szCs w:val="24"/>
+                <w:rtl w:val="0"/>
+              </w:rPr>
+              <w:t xml:space="preserve">Lucas Padilla</w:t>
+            </w:r>
             <w:r>
               <w:rPr>
                 <w:rtl w:val="0"/>
@@ -1578,7 +1724,7 @@
           <w:p>
             <w:pPr>
               <w:tabs>
-                <w:tab w:val="left" w:pos="1276"/>
+                <w:tab w:val="left" w:leader="none" w:pos="1276"/>
               </w:tabs>
               <w:rPr>
                 <w:color w:val="000000"/>
@@ -1598,7 +1744,7 @@
           <w:p>
             <w:pPr>
               <w:tabs>
-                <w:tab w:val="left" w:pos="1276"/>
+                <w:tab w:val="left" w:leader="none" w:pos="1276"/>
               </w:tabs>
               <w:rPr>
                 <w:color w:val="000000"/>
@@ -1618,7 +1764,7 @@
           <w:p>
             <w:pPr>
               <w:tabs>
-                <w:tab w:val="left" w:pos="1276"/>
+                <w:tab w:val="left" w:leader="none" w:pos="1276"/>
               </w:tabs>
               <w:rPr>
                 <w:color w:val="000000"/>
@@ -1638,7 +1784,7 @@
           <w:p>
             <w:pPr>
               <w:tabs>
-                <w:tab w:val="left" w:pos="1276"/>
+                <w:tab w:val="left" w:leader="none" w:pos="1276"/>
               </w:tabs>
               <w:rPr>
                 <w:color w:val="000000"/>
@@ -1658,7 +1804,7 @@
     <w:p>
       <w:pPr>
         <w:tabs>
-          <w:tab w:val="left" w:pos="1276"/>
+          <w:tab w:val="left" w:leader="none" w:pos="1276"/>
         </w:tabs>
         <w:rPr>
           <w:color w:val="000000"/>
@@ -1682,8 +1828,8 @@
           <w:szCs w:val="24"/>
         </w:rPr>
       </w:pPr>
-      <w:bookmarkStart w:colFirst="0" w:colLast="0" w:name="_heading=h.3znysh7" w:id="4"/>
-      <w:bookmarkEnd w:id="4"/>
+      <w:bookmarkStart w:colFirst="0" w:colLast="0" w:name="_heading=h.3znysh7" w:id="3"/>
+      <w:bookmarkEnd w:id="3"/>
       <w:r>
         <w:rPr>
           <w:color w:val="000000"/>
@@ -1807,6 +1953,12 @@
               <w:rPr>
                 <w:rtl w:val="0"/>
               </w:rPr>
+              <w:t xml:space="preserve">Capstone_001D</w:t>
+            </w:r>
+            <w:r>
+              <w:rPr>
+                <w:rtl w:val="0"/>
+              </w:rPr>
             </w:r>
           </w:p>
         </w:tc>
@@ -1851,6 +2003,12 @@
               <w:rPr>
                 <w:rtl w:val="0"/>
               </w:rPr>
+              <w:t xml:space="preserve">HomeCount_Simulator</w:t>
+            </w:r>
+            <w:r>
+              <w:rPr>
+                <w:rtl w:val="0"/>
+              </w:rPr>
             </w:r>
           </w:p>
         </w:tc>
@@ -1881,20 +2039,17 @@
           </w:p>
         </w:tc>
         <w:tc>
-          <w:tcPr>
-            <w:shd w:fill="auto" w:val="clear"/>
-          </w:tcPr>
+          <w:tcPr/>
           <w:p>
             <w:pPr>
               <w:spacing w:after="0" w:line="240" w:lineRule="auto"/>
-              <w:rPr>
-                <w:color w:val="000000"/>
-              </w:rPr>
-            </w:pPr>
-            <w:r>
-              <w:rPr>
-                <w:rtl w:val="0"/>
-              </w:rPr>
+              <w:rPr/>
+            </w:pPr>
+            <w:r>
+              <w:rPr>
+                <w:rtl w:val="0"/>
+              </w:rPr>
+              <w:t xml:space="preserve">11-08-2026</w:t>
             </w:r>
           </w:p>
         </w:tc>
@@ -1925,20 +2080,17 @@
           </w:p>
         </w:tc>
         <w:tc>
-          <w:tcPr>
-            <w:shd w:fill="auto" w:val="clear"/>
-          </w:tcPr>
+          <w:tcPr/>
           <w:p>
             <w:pPr>
               <w:spacing w:after="0" w:line="240" w:lineRule="auto"/>
-              <w:rPr>
-                <w:color w:val="000000"/>
-              </w:rPr>
-            </w:pPr>
-            <w:r>
-              <w:rPr>
-                <w:rtl w:val="0"/>
-              </w:rPr>
+              <w:rPr/>
+            </w:pPr>
+            <w:r>
+              <w:rPr>
+                <w:rtl w:val="0"/>
+              </w:rPr>
+              <w:t xml:space="preserve">22-12-2026</w:t>
             </w:r>
           </w:p>
         </w:tc>
@@ -1983,6 +2135,12 @@
               <w:rPr>
                 <w:rtl w:val="0"/>
               </w:rPr>
+              <w:t xml:space="preserve">Alejandro casellas y Carlos Márquez</w:t>
+            </w:r>
+            <w:r>
+              <w:rPr>
+                <w:rtl w:val="0"/>
+              </w:rPr>
             </w:r>
           </w:p>
         </w:tc>
@@ -2013,20 +2171,17 @@
           </w:p>
         </w:tc>
         <w:tc>
-          <w:tcPr>
-            <w:shd w:fill="auto" w:val="clear"/>
-          </w:tcPr>
+          <w:tcPr/>
           <w:p>
             <w:pPr>
               <w:spacing w:after="0" w:line="240" w:lineRule="auto"/>
-              <w:rPr>
-                <w:color w:val="000000"/>
-              </w:rPr>
-            </w:pPr>
-            <w:r>
-              <w:rPr>
-                <w:rtl w:val="0"/>
-              </w:rPr>
+              <w:rPr/>
+            </w:pPr>
+            <w:r>
+              <w:rPr>
+                <w:rtl w:val="0"/>
+              </w:rPr>
+              <w:t xml:space="preserve">Juan Andres Hernandez Aliaga </w:t>
             </w:r>
           </w:p>
         </w:tc>
@@ -2041,8 +2196,8 @@
           <w:szCs w:val="24"/>
         </w:rPr>
       </w:pPr>
-      <w:bookmarkStart w:colFirst="0" w:colLast="0" w:name="_heading=h.2et92p0" w:id="5"/>
-      <w:bookmarkEnd w:id="5"/>
+      <w:bookmarkStart w:colFirst="0" w:colLast="0" w:name="_heading=h.2et92p0" w:id="4"/>
+      <w:bookmarkEnd w:id="4"/>
       <w:r>
         <w:rPr>
           <w:rtl w:val="0"/>
@@ -2172,6 +2327,38 @@
           <w:tblHeader w:val="0"/>
         </w:trPr>
         <w:tc>
+          <w:tcPr/>
+          <w:p>
+            <w:pPr>
+              <w:spacing w:after="0" w:line="240" w:lineRule="auto"/>
+              <w:jc w:val="center"/>
+              <w:rPr/>
+            </w:pPr>
+            <w:r>
+              <w:rPr>
+                <w:rtl w:val="0"/>
+              </w:rPr>
+              <w:t xml:space="preserve">21.440.449-4</w:t>
+            </w:r>
+          </w:p>
+        </w:tc>
+        <w:tc>
+          <w:tcPr/>
+          <w:p>
+            <w:pPr>
+              <w:spacing w:after="0" w:line="240" w:lineRule="auto"/>
+              <w:jc w:val="center"/>
+              <w:rPr/>
+            </w:pPr>
+            <w:r>
+              <w:rPr>
+                <w:rtl w:val="0"/>
+              </w:rPr>
+              <w:t xml:space="preserve">Lucas Ignacio Padilla Aliaga</w:t>
+            </w:r>
+          </w:p>
+        </w:tc>
+        <w:tc>
           <w:tcPr>
             <w:shd w:fill="auto" w:val="clear"/>
           </w:tcPr>
@@ -2181,49 +2368,23 @@
               <w:jc w:val="center"/>
               <w:rPr>
                 <w:b w:val="1"/>
+                <w:bCs w:val="1"/>
                 <w:color w:val="000000"/>
               </w:rPr>
             </w:pPr>
-            <w:r>
-              <w:rPr>
-                <w:rtl w:val="0"/>
-              </w:rPr>
-            </w:r>
-          </w:p>
-        </w:tc>
-        <w:tc>
-          <w:tcPr>
-            <w:shd w:fill="auto" w:val="clear"/>
-          </w:tcPr>
-          <w:p>
-            <w:pPr>
-              <w:spacing w:after="0" w:line="240" w:lineRule="auto"/>
-              <w:jc w:val="center"/>
-              <w:rPr>
-                <w:b w:val="1"/>
-                <w:color w:val="000000"/>
-              </w:rPr>
-            </w:pPr>
-            <w:r>
-              <w:rPr>
-                <w:rtl w:val="0"/>
-              </w:rPr>
-            </w:r>
-          </w:p>
-        </w:tc>
-        <w:tc>
-          <w:tcPr>
-            <w:shd w:fill="auto" w:val="clear"/>
-          </w:tcPr>
-          <w:p>
-            <w:pPr>
-              <w:spacing w:after="0" w:line="240" w:lineRule="auto"/>
-              <w:jc w:val="center"/>
-              <w:rPr>
-                <w:b w:val="1"/>
-                <w:color w:val="000000"/>
-              </w:rPr>
-            </w:pPr>
+            <w:hyperlink r:id="rId7">
+              <w:r>
+                <w:rPr>
+                  <w:rFonts w:ascii="Roboto" w:cs="Roboto" w:eastAsia="Roboto" w:hAnsi="Roboto"/>
+                  <w:color w:val="0000ee"/>
+                  <w:sz w:val="18"/>
+                  <w:szCs w:val="18"/>
+                  <w:u w:val="single"/>
+                  <w:rtl w:val="0"/>
+                </w:rPr>
+                <w:t xml:space="preserve">luc.padilla@duocuc.cl</w:t>
+              </w:r>
+            </w:hyperlink>
             <w:r>
               <w:rPr>
                 <w:rtl w:val="0"/>
@@ -2238,6 +2399,38 @@
           <w:tblHeader w:val="0"/>
         </w:trPr>
         <w:tc>
+          <w:tcPr/>
+          <w:p>
+            <w:pPr>
+              <w:spacing w:after="0" w:line="240" w:lineRule="auto"/>
+              <w:jc w:val="center"/>
+              <w:rPr/>
+            </w:pPr>
+            <w:r>
+              <w:rPr>
+                <w:rtl w:val="0"/>
+              </w:rPr>
+              <w:t xml:space="preserve">21.171.660-6</w:t>
+            </w:r>
+          </w:p>
+        </w:tc>
+        <w:tc>
+          <w:tcPr/>
+          <w:p>
+            <w:pPr>
+              <w:spacing w:after="0" w:line="240" w:lineRule="auto"/>
+              <w:jc w:val="center"/>
+              <w:rPr/>
+            </w:pPr>
+            <w:r>
+              <w:rPr>
+                <w:rtl w:val="0"/>
+              </w:rPr>
+              <w:t xml:space="preserve">Benjamin Isaac Casellas Madrid</w:t>
+            </w:r>
+          </w:p>
+        </w:tc>
+        <w:tc>
           <w:tcPr>
             <w:shd w:fill="auto" w:val="clear"/>
           </w:tcPr>
@@ -2247,49 +2440,23 @@
               <w:jc w:val="center"/>
               <w:rPr>
                 <w:b w:val="1"/>
+                <w:bCs w:val="1"/>
                 <w:color w:val="000000"/>
               </w:rPr>
             </w:pPr>
-            <w:r>
-              <w:rPr>
-                <w:rtl w:val="0"/>
-              </w:rPr>
-            </w:r>
-          </w:p>
-        </w:tc>
-        <w:tc>
-          <w:tcPr>
-            <w:shd w:fill="auto" w:val="clear"/>
-          </w:tcPr>
-          <w:p>
-            <w:pPr>
-              <w:spacing w:after="0" w:line="240" w:lineRule="auto"/>
-              <w:jc w:val="center"/>
-              <w:rPr>
-                <w:b w:val="1"/>
-                <w:color w:val="000000"/>
-              </w:rPr>
-            </w:pPr>
-            <w:r>
-              <w:rPr>
-                <w:rtl w:val="0"/>
-              </w:rPr>
-            </w:r>
-          </w:p>
-        </w:tc>
-        <w:tc>
-          <w:tcPr>
-            <w:shd w:fill="auto" w:val="clear"/>
-          </w:tcPr>
-          <w:p>
-            <w:pPr>
-              <w:spacing w:after="0" w:line="240" w:lineRule="auto"/>
-              <w:jc w:val="center"/>
-              <w:rPr>
-                <w:b w:val="1"/>
-                <w:color w:val="000000"/>
-              </w:rPr>
-            </w:pPr>
+            <w:hyperlink r:id="rId8">
+              <w:r>
+                <w:rPr>
+                  <w:rFonts w:ascii="Roboto" w:cs="Roboto" w:eastAsia="Roboto" w:hAnsi="Roboto"/>
+                  <w:color w:val="0000ee"/>
+                  <w:sz w:val="18"/>
+                  <w:szCs w:val="18"/>
+                  <w:u w:val="single"/>
+                  <w:rtl w:val="0"/>
+                </w:rPr>
+                <w:t xml:space="preserve">be.casellas@duocuc.cl</w:t>
+              </w:r>
+            </w:hyperlink>
             <w:r>
               <w:rPr>
                 <w:rtl w:val="0"/>
@@ -2304,62 +2471,50 @@
           <w:tblHeader w:val="0"/>
         </w:trPr>
         <w:tc>
-          <w:tcPr>
-            <w:shd w:fill="auto" w:val="clear"/>
-          </w:tcPr>
+          <w:tcPr/>
           <w:p>
             <w:pPr>
               <w:spacing w:after="0" w:line="240" w:lineRule="auto"/>
               <w:jc w:val="center"/>
-              <w:rPr>
-                <w:b w:val="1"/>
-                <w:color w:val="000000"/>
-              </w:rPr>
-            </w:pPr>
-            <w:r>
-              <w:rPr>
-                <w:rtl w:val="0"/>
-              </w:rPr>
-            </w:r>
-          </w:p>
-        </w:tc>
-        <w:tc>
-          <w:tcPr>
-            <w:shd w:fill="auto" w:val="clear"/>
-          </w:tcPr>
+              <w:rPr/>
+            </w:pPr>
+            <w:r>
+              <w:rPr>
+                <w:rtl w:val="0"/>
+              </w:rPr>
+              <w:t xml:space="preserve">21.333.703-3</w:t>
+            </w:r>
+          </w:p>
+        </w:tc>
+        <w:tc>
+          <w:tcPr/>
           <w:p>
             <w:pPr>
               <w:spacing w:after="0" w:line="240" w:lineRule="auto"/>
               <w:jc w:val="center"/>
-              <w:rPr>
-                <w:b w:val="1"/>
-                <w:color w:val="000000"/>
-              </w:rPr>
-            </w:pPr>
-            <w:r>
-              <w:rPr>
-                <w:rtl w:val="0"/>
-              </w:rPr>
-            </w:r>
-          </w:p>
-        </w:tc>
-        <w:tc>
-          <w:tcPr>
-            <w:shd w:fill="auto" w:val="clear"/>
-          </w:tcPr>
+              <w:rPr/>
+            </w:pPr>
+            <w:r>
+              <w:rPr>
+                <w:rtl w:val="0"/>
+              </w:rPr>
+              <w:t xml:space="preserve">Benjamín Tomás Núñez Arancibia</w:t>
+            </w:r>
+          </w:p>
+        </w:tc>
+        <w:tc>
+          <w:tcPr/>
           <w:p>
             <w:pPr>
               <w:spacing w:after="0" w:line="240" w:lineRule="auto"/>
               <w:jc w:val="center"/>
-              <w:rPr>
-                <w:b w:val="1"/>
-                <w:color w:val="000000"/>
-              </w:rPr>
-            </w:pPr>
-            <w:r>
-              <w:rPr>
-                <w:rtl w:val="0"/>
-              </w:rPr>
+              <w:rPr/>
+            </w:pPr>
+            <w:r>
+              <w:rPr>
+                <w:rtl w:val="0"/>
+              </w:rPr>
+              <w:t xml:space="preserve">benj.nuneza@duocuc.cl</w:t>
             </w:r>
           </w:p>
         </w:tc>
@@ -2379,13 +2534,35 @@
               <w:jc w:val="center"/>
               <w:rPr>
                 <w:b w:val="1"/>
-                <w:color w:val="000000"/>
-              </w:rPr>
-            </w:pPr>
-            <w:r>
-              <w:rPr>
-                <w:rtl w:val="0"/>
-              </w:rPr>
+                <w:bCs w:val="1"/>
+              </w:rPr>
+            </w:pPr>
+            <w:r>
+              <w:rPr>
+                <w:rtl w:val="0"/>
+              </w:rPr>
+              <w:t xml:space="preserve">21.446.771-2</w:t>
+            </w:r>
+            <w:r>
+              <w:rPr>
+                <w:rtl w:val="0"/>
+              </w:rPr>
+            </w:r>
+          </w:p>
+        </w:tc>
+        <w:tc>
+          <w:tcPr/>
+          <w:p>
+            <w:pPr>
+              <w:spacing w:after="0" w:line="240" w:lineRule="auto"/>
+              <w:jc w:val="center"/>
+              <w:rPr/>
+            </w:pPr>
+            <w:r>
+              <w:rPr>
+                <w:rtl w:val="0"/>
+              </w:rPr>
+              <w:t xml:space="preserve">Emilio Castro Gonzalez</w:t>
             </w:r>
           </w:p>
         </w:tc>
@@ -2399,95 +2576,23 @@
               <w:jc w:val="center"/>
               <w:rPr>
                 <w:b w:val="1"/>
+                <w:bCs w:val="1"/>
                 <w:color w:val="000000"/>
               </w:rPr>
             </w:pPr>
-            <w:r>
-              <w:rPr>
-                <w:rtl w:val="0"/>
-              </w:rPr>
-            </w:r>
-          </w:p>
-        </w:tc>
-        <w:tc>
-          <w:tcPr>
-            <w:shd w:fill="auto" w:val="clear"/>
-          </w:tcPr>
-          <w:p>
-            <w:pPr>
-              <w:spacing w:after="0" w:line="240" w:lineRule="auto"/>
-              <w:jc w:val="center"/>
-              <w:rPr>
-                <w:b w:val="1"/>
-                <w:color w:val="000000"/>
-              </w:rPr>
-            </w:pPr>
-            <w:r>
-              <w:rPr>
-                <w:rtl w:val="0"/>
-              </w:rPr>
-            </w:r>
-          </w:p>
-        </w:tc>
-      </w:tr>
-      <w:tr>
-        <w:trPr>
-          <w:cantSplit w:val="0"/>
-          <w:tblHeader w:val="0"/>
-        </w:trPr>
-        <w:tc>
-          <w:tcPr>
-            <w:shd w:fill="auto" w:val="clear"/>
-          </w:tcPr>
-          <w:p>
-            <w:pPr>
-              <w:spacing w:after="0" w:line="240" w:lineRule="auto"/>
-              <w:jc w:val="center"/>
-              <w:rPr>
-                <w:b w:val="1"/>
-                <w:color w:val="000000"/>
-              </w:rPr>
-            </w:pPr>
-            <w:r>
-              <w:rPr>
-                <w:rtl w:val="0"/>
-              </w:rPr>
-            </w:r>
-          </w:p>
-        </w:tc>
-        <w:tc>
-          <w:tcPr>
-            <w:shd w:fill="auto" w:val="clear"/>
-          </w:tcPr>
-          <w:p>
-            <w:pPr>
-              <w:spacing w:after="0" w:line="240" w:lineRule="auto"/>
-              <w:jc w:val="center"/>
-              <w:rPr>
-                <w:b w:val="1"/>
-                <w:color w:val="000000"/>
-              </w:rPr>
-            </w:pPr>
-            <w:r>
-              <w:rPr>
-                <w:rtl w:val="0"/>
-              </w:rPr>
-            </w:r>
-          </w:p>
-        </w:tc>
-        <w:tc>
-          <w:tcPr>
-            <w:shd w:fill="auto" w:val="clear"/>
-          </w:tcPr>
-          <w:p>
-            <w:pPr>
-              <w:spacing w:after="0" w:line="240" w:lineRule="auto"/>
-              <w:jc w:val="center"/>
-              <w:rPr>
-                <w:b w:val="1"/>
-                <w:color w:val="000000"/>
-              </w:rPr>
-            </w:pPr>
+            <w:hyperlink r:id="rId9">
+              <w:r>
+                <w:rPr>
+                  <w:rFonts w:ascii="Roboto" w:cs="Roboto" w:eastAsia="Roboto" w:hAnsi="Roboto"/>
+                  <w:color w:val="0000ee"/>
+                  <w:sz w:val="18"/>
+                  <w:szCs w:val="18"/>
+                  <w:u w:val="single"/>
+                  <w:rtl w:val="0"/>
+                </w:rPr>
+                <w:t xml:space="preserve">em.castro@duocuc.cl</w:t>
+              </w:r>
+            </w:hyperlink>
             <w:r>
               <w:rPr>
                 <w:rtl w:val="0"/>
@@ -2499,77 +2604,109 @@
     </w:tbl>
     <w:p>
       <w:pPr>
-        <w:pStyle w:val="Heading1"/>
-        <w:rPr/>
+        <w:keepNext w:val="1"/>
+        <w:keepLines w:val="1"/>
+        <w:pageBreakBefore w:val="0"/>
+        <w:widowControl w:val="1"/>
+        <w:pBdr>
+          <w:top w:space="0" w:sz="0" w:val="nil"/>
+          <w:left w:space="0" w:sz="0" w:val="nil"/>
+          <w:bottom w:space="0" w:sz="0" w:val="nil"/>
+          <w:right w:space="0" w:sz="0" w:val="nil"/>
+          <w:between w:space="0" w:sz="0" w:val="nil"/>
+        </w:pBdr>
+        <w:shd w:fill="auto" w:val="clear"/>
+        <w:spacing w:after="0" w:before="480" w:line="276" w:lineRule="auto"/>
+        <w:ind w:left="0" w:right="0" w:firstLine="0"/>
+        <w:jc w:val="left"/>
+        <w:rPr>
+          <w:rFonts w:ascii="Cambria" w:cs="Cambria" w:eastAsia="Cambria" w:hAnsi="Cambria"/>
+          <w:b w:val="1"/>
+          <w:bCs w:val="1"/>
+          <w:i w:val="0"/>
+          <w:iCs w:val="0"/>
+          <w:smallCaps w:val="0"/>
+          <w:strike w:val="0"/>
+          <w:color w:val="366091"/>
+          <w:sz w:val="28"/>
+          <w:szCs w:val="28"/>
+          <w:u w:val="none"/>
+          <w:shd w:fill="auto" w:val="clear"/>
+          <w:vertAlign w:val="baseline"/>
+        </w:rPr>
       </w:pPr>
-      <w:r>
-        <w:rPr>
-          <w:rtl w:val="0"/>
-        </w:rPr>
+      <w:bookmarkStart w:colFirst="0" w:colLast="0" w:name="_heading=h.tyjcwt" w:id="5"/>
+      <w:bookmarkEnd w:id="5"/>
+      <w:r>
+        <w:rPr>
+          <w:rFonts w:ascii="Cambria" w:cs="Cambria" w:eastAsia="Cambria" w:hAnsi="Cambria"/>
+          <w:b w:val="1"/>
+          <w:bCs w:val="1"/>
+          <w:i w:val="0"/>
+          <w:iCs w:val="0"/>
+          <w:smallCaps w:val="0"/>
+          <w:strike w:val="0"/>
+          <w:color w:val="366091"/>
+          <w:sz w:val="28"/>
+          <w:szCs w:val="28"/>
+          <w:u w:val="none"/>
+          <w:shd w:fill="auto" w:val="clear"/>
+          <w:vertAlign w:val="baseline"/>
+          <w:rtl w:val="0"/>
+        </w:rPr>
+        <w:t xml:space="preserve">Product Backlog del Proyecto “ nombre del proyecto”  </w:t>
       </w:r>
     </w:p>
     <w:p>
       <w:pPr>
-        <w:rPr>
-          <w:color w:val="000000"/>
-          <w:sz w:val="24"/>
-          <w:szCs w:val="24"/>
-          <w:u w:val="single"/>
+        <w:keepNext w:val="1"/>
+        <w:keepLines w:val="1"/>
+        <w:pageBreakBefore w:val="0"/>
+        <w:widowControl w:val="1"/>
+        <w:pBdr>
+          <w:top w:space="0" w:sz="0" w:val="nil"/>
+          <w:left w:space="0" w:sz="0" w:val="nil"/>
+          <w:bottom w:space="0" w:sz="0" w:val="nil"/>
+          <w:right w:space="0" w:sz="0" w:val="nil"/>
+          <w:between w:space="0" w:sz="0" w:val="nil"/>
+        </w:pBdr>
+        <w:shd w:fill="auto" w:val="clear"/>
+        <w:spacing w:after="0" w:before="200" w:line="276" w:lineRule="auto"/>
+        <w:ind w:left="0" w:right="0" w:firstLine="0"/>
+        <w:jc w:val="left"/>
+        <w:rPr>
+          <w:rFonts w:ascii="Cambria" w:cs="Cambria" w:eastAsia="Cambria" w:hAnsi="Cambria"/>
+          <w:b w:val="1"/>
+          <w:bCs w:val="1"/>
+          <w:i w:val="0"/>
+          <w:iCs w:val="0"/>
+          <w:smallCaps w:val="0"/>
+          <w:strike w:val="0"/>
+          <w:color w:val="4f81bd"/>
+          <w:sz w:val="26"/>
+          <w:szCs w:val="26"/>
+          <w:u w:val="none"/>
+          <w:shd w:fill="auto" w:val="clear"/>
+          <w:vertAlign w:val="baseline"/>
         </w:rPr>
       </w:pPr>
-      <w:r>
-        <w:br w:type="page"/>
-      </w:r>
-      <w:r>
-        <w:rPr>
-          <w:rtl w:val="0"/>
-        </w:rPr>
-      </w:r>
-    </w:p>
-    <w:p>
-      <w:pPr>
-        <w:pStyle w:val="Heading2"/>
-        <w:rPr/>
-      </w:pPr>
-      <w:r>
-        <w:rPr>
-          <w:rtl w:val="0"/>
-        </w:rPr>
-      </w:r>
-    </w:p>
-    <w:p>
-      <w:pPr>
-        <w:rPr/>
-      </w:pPr>
-      <w:r>
-        <w:rPr>
-          <w:rtl w:val="0"/>
-        </w:rPr>
-      </w:r>
-    </w:p>
-    <w:p>
-      <w:pPr>
-        <w:pStyle w:val="Heading1"/>
-        <w:rPr/>
-      </w:pPr>
-      <w:bookmarkStart w:colFirst="0" w:colLast="0" w:name="_heading=h.tyjcwt" w:id="6"/>
+      <w:bookmarkStart w:colFirst="0" w:colLast="0" w:name="_heading=h.3dy6vkm" w:id="6"/>
       <w:bookmarkEnd w:id="6"/>
       <w:r>
         <w:rPr>
-          <w:rtl w:val="0"/>
-        </w:rPr>
-        <w:t xml:space="preserve">Product Backlog del Proyecto “ nombre del proyecto”  </w:t>
-      </w:r>
-    </w:p>
-    <w:p>
-      <w:pPr>
-        <w:pStyle w:val="Heading2"/>
-        <w:rPr/>
-      </w:pPr>
-      <w:bookmarkStart w:colFirst="0" w:colLast="0" w:name="_heading=h.3dy6vkm" w:id="7"/>
-      <w:bookmarkEnd w:id="7"/>
-      <w:r>
-        <w:rPr>
+          <w:rFonts w:ascii="Cambria" w:cs="Cambria" w:eastAsia="Cambria" w:hAnsi="Cambria"/>
+          <w:b w:val="1"/>
+          <w:bCs w:val="1"/>
+          <w:i w:val="0"/>
+          <w:iCs w:val="0"/>
+          <w:smallCaps w:val="0"/>
+          <w:strike w:val="0"/>
+          <w:color w:val="4f81bd"/>
+          <w:sz w:val="26"/>
+          <w:szCs w:val="26"/>
+          <w:u w:val="none"/>
+          <w:shd w:fill="auto" w:val="clear"/>
+          <w:vertAlign w:val="baseline"/>
           <w:rtl w:val="0"/>
         </w:rPr>
         <w:t xml:space="preserve">Estimación de puntos de historia.</w:t>
@@ -2580,7 +2717,6 @@
         <w:tblStyle w:val="Table4"/>
         <w:tblW w:w="8828.0" w:type="dxa"/>
         <w:jc w:val="left"/>
-        <w:tblInd w:w="0.0" w:type="dxa"/>
         <w:tblBorders>
           <w:top w:color="000000" w:space="0" w:sz="4" w:val="single"/>
           <w:left w:color="000000" w:space="0" w:sz="4" w:val="single"/>
@@ -2618,11 +2754,13 @@
               <w:jc w:val="center"/>
               <w:rPr>
                 <w:b w:val="1"/>
+                <w:bCs w:val="1"/>
               </w:rPr>
             </w:pPr>
             <w:r>
               <w:rPr>
                 <w:b w:val="1"/>
+                <w:bCs w:val="1"/>
                 <w:rtl w:val="0"/>
               </w:rPr>
               <w:t xml:space="preserve">ID</w:t>
@@ -2637,11 +2775,13 @@
             <w:pPr>
               <w:rPr>
                 <w:b w:val="1"/>
+                <w:bCs w:val="1"/>
               </w:rPr>
             </w:pPr>
             <w:r>
               <w:rPr>
                 <w:b w:val="1"/>
+                <w:bCs w:val="1"/>
                 <w:rtl w:val="0"/>
               </w:rPr>
               <w:t xml:space="preserve">Historia de Usuario</w:t>
@@ -2656,11 +2796,13 @@
             <w:pPr>
               <w:rPr>
                 <w:b w:val="1"/>
+                <w:bCs w:val="1"/>
               </w:rPr>
             </w:pPr>
             <w:r>
               <w:rPr>
                 <w:b w:val="1"/>
+                <w:bCs w:val="1"/>
                 <w:rtl w:val="0"/>
               </w:rPr>
               <w:t xml:space="preserve">Estimación</w:t>
@@ -2683,42 +2825,35 @@
               <w:rPr>
                 <w:rtl w:val="0"/>
               </w:rPr>
-            </w:r>
-          </w:p>
-          <w:p>
-            <w:pPr>
-              <w:rPr/>
-            </w:pPr>
-            <w:r>
-              <w:rPr>
-                <w:rtl w:val="0"/>
-              </w:rPr>
-            </w:r>
-          </w:p>
-        </w:tc>
-        <w:tc>
-          <w:tcPr/>
-          <w:p>
-            <w:pPr>
-              <w:rPr/>
-            </w:pPr>
-            <w:r>
-              <w:rPr>
-                <w:rtl w:val="0"/>
-              </w:rPr>
-            </w:r>
-          </w:p>
-        </w:tc>
-        <w:tc>
-          <w:tcPr/>
-          <w:p>
-            <w:pPr>
-              <w:rPr/>
-            </w:pPr>
-            <w:r>
-              <w:rPr>
-                <w:rtl w:val="0"/>
-              </w:rPr>
+              <w:t xml:space="preserve">HCS-001</w:t>
+            </w:r>
+          </w:p>
+        </w:tc>
+        <w:tc>
+          <w:tcPr/>
+          <w:p>
+            <w:pPr>
+              <w:rPr/>
+            </w:pPr>
+            <w:r>
+              <w:rPr>
+                <w:rtl w:val="0"/>
+              </w:rPr>
+              <w:t xml:space="preserve">Como un usuario consultor necesito poder ingresar mi presupuesto con la finalidad de recibir sugerencias acordes con el presupuesto ingresado</w:t>
+            </w:r>
+          </w:p>
+        </w:tc>
+        <w:tc>
+          <w:tcPr/>
+          <w:p>
+            <w:pPr>
+              <w:rPr/>
+            </w:pPr>
+            <w:r>
+              <w:rPr>
+                <w:rtl w:val="0"/>
+              </w:rPr>
+              <w:t xml:space="preserve">2 semana</w:t>
             </w:r>
           </w:p>
         </w:tc>
@@ -2738,42 +2873,35 @@
               <w:rPr>
                 <w:rtl w:val="0"/>
               </w:rPr>
-            </w:r>
-          </w:p>
-          <w:p>
-            <w:pPr>
-              <w:rPr/>
-            </w:pPr>
-            <w:r>
-              <w:rPr>
-                <w:rtl w:val="0"/>
-              </w:rPr>
-            </w:r>
-          </w:p>
-        </w:tc>
-        <w:tc>
-          <w:tcPr/>
-          <w:p>
-            <w:pPr>
-              <w:rPr/>
-            </w:pPr>
-            <w:r>
-              <w:rPr>
-                <w:rtl w:val="0"/>
-              </w:rPr>
-            </w:r>
-          </w:p>
-        </w:tc>
-        <w:tc>
-          <w:tcPr/>
-          <w:p>
-            <w:pPr>
-              <w:rPr/>
-            </w:pPr>
-            <w:r>
-              <w:rPr>
-                <w:rtl w:val="0"/>
-              </w:rPr>
+              <w:t xml:space="preserve">HCS-002</w:t>
+            </w:r>
+          </w:p>
+        </w:tc>
+        <w:tc>
+          <w:tcPr/>
+          <w:p>
+            <w:pPr>
+              <w:rPr/>
+            </w:pPr>
+            <w:r>
+              <w:rPr>
+                <w:rtl w:val="0"/>
+              </w:rPr>
+              <w:t xml:space="preserve">Como un usuario en proceso de diseño necesito configurar los módulos de la vivienda en planeación con la finalidad de que el sistema calcula dinámicamente un presupuesto necesario</w:t>
+            </w:r>
+          </w:p>
+        </w:tc>
+        <w:tc>
+          <w:tcPr/>
+          <w:p>
+            <w:pPr>
+              <w:rPr/>
+            </w:pPr>
+            <w:r>
+              <w:rPr>
+                <w:rtl w:val="0"/>
+              </w:rPr>
+              <w:t xml:space="preserve">3 semanas</w:t>
             </w:r>
           </w:p>
         </w:tc>
@@ -2793,42 +2921,45 @@
               <w:rPr>
                 <w:rtl w:val="0"/>
               </w:rPr>
-            </w:r>
-          </w:p>
-          <w:p>
-            <w:pPr>
-              <w:rPr/>
-            </w:pPr>
-            <w:r>
-              <w:rPr>
-                <w:rtl w:val="0"/>
-              </w:rPr>
-            </w:r>
-          </w:p>
-        </w:tc>
-        <w:tc>
-          <w:tcPr/>
-          <w:p>
-            <w:pPr>
-              <w:rPr/>
-            </w:pPr>
-            <w:r>
-              <w:rPr>
-                <w:rtl w:val="0"/>
-              </w:rPr>
-            </w:r>
-          </w:p>
-        </w:tc>
-        <w:tc>
-          <w:tcPr/>
-          <w:p>
-            <w:pPr>
-              <w:rPr/>
-            </w:pPr>
-            <w:r>
-              <w:rPr>
-                <w:rtl w:val="0"/>
-              </w:rPr>
+              <w:t xml:space="preserve">HCS-003</w:t>
+            </w:r>
+          </w:p>
+          <w:p>
+            <w:pPr>
+              <w:rPr/>
+            </w:pPr>
+            <w:r>
+              <w:rPr>
+                <w:rtl w:val="0"/>
+              </w:rPr>
+            </w:r>
+          </w:p>
+        </w:tc>
+        <w:tc>
+          <w:tcPr/>
+          <w:p>
+            <w:pPr>
+              <w:rPr/>
+            </w:pPr>
+            <w:r>
+              <w:rPr>
+                <w:rtl w:val="0"/>
+              </w:rPr>
+              <w:t xml:space="preserve">Como un usuario en proceso de diseño necesito ver el desglose detallado de los materiales calculados con la finalidad de conocer las cantidades exactas y precios unitarios requeridos para la obra</w:t>
+            </w:r>
+          </w:p>
+        </w:tc>
+        <w:tc>
+          <w:tcPr/>
+          <w:p>
+            <w:pPr>
+              <w:rPr/>
+            </w:pPr>
+            <w:r>
+              <w:rPr>
+                <w:rtl w:val="0"/>
+              </w:rPr>
+              <w:t xml:space="preserve">3 semanas</w:t>
             </w:r>
           </w:p>
         </w:tc>
@@ -2848,207 +2979,45 @@
               <w:rPr>
                 <w:rtl w:val="0"/>
               </w:rPr>
-            </w:r>
-          </w:p>
-          <w:p>
-            <w:pPr>
-              <w:rPr/>
-            </w:pPr>
-            <w:r>
-              <w:rPr>
-                <w:rtl w:val="0"/>
-              </w:rPr>
-            </w:r>
-          </w:p>
-        </w:tc>
-        <w:tc>
-          <w:tcPr/>
-          <w:p>
-            <w:pPr>
-              <w:rPr/>
-            </w:pPr>
-            <w:r>
-              <w:rPr>
-                <w:rtl w:val="0"/>
-              </w:rPr>
-            </w:r>
-          </w:p>
-        </w:tc>
-        <w:tc>
-          <w:tcPr/>
-          <w:p>
-            <w:pPr>
-              <w:rPr/>
-            </w:pPr>
-            <w:r>
-              <w:rPr>
-                <w:rtl w:val="0"/>
-              </w:rPr>
-            </w:r>
-          </w:p>
-        </w:tc>
-      </w:tr>
-      <w:tr>
-        <w:trPr>
-          <w:cantSplit w:val="0"/>
-          <w:tblHeader w:val="0"/>
-        </w:trPr>
-        <w:tc>
-          <w:tcPr/>
-          <w:p>
-            <w:pPr>
-              <w:rPr/>
-            </w:pPr>
-            <w:r>
-              <w:rPr>
-                <w:rtl w:val="0"/>
-              </w:rPr>
-            </w:r>
-          </w:p>
-          <w:p>
-            <w:pPr>
-              <w:rPr/>
-            </w:pPr>
-            <w:r>
-              <w:rPr>
-                <w:rtl w:val="0"/>
-              </w:rPr>
-            </w:r>
-          </w:p>
-        </w:tc>
-        <w:tc>
-          <w:tcPr/>
-          <w:p>
-            <w:pPr>
-              <w:rPr/>
-            </w:pPr>
-            <w:r>
-              <w:rPr>
-                <w:rtl w:val="0"/>
-              </w:rPr>
-            </w:r>
-          </w:p>
-        </w:tc>
-        <w:tc>
-          <w:tcPr/>
-          <w:p>
-            <w:pPr>
-              <w:rPr/>
-            </w:pPr>
-            <w:r>
-              <w:rPr>
-                <w:rtl w:val="0"/>
-              </w:rPr>
-            </w:r>
-          </w:p>
-        </w:tc>
-      </w:tr>
-      <w:tr>
-        <w:trPr>
-          <w:cantSplit w:val="0"/>
-          <w:tblHeader w:val="0"/>
-        </w:trPr>
-        <w:tc>
-          <w:tcPr/>
-          <w:p>
-            <w:pPr>
-              <w:rPr/>
-            </w:pPr>
-            <w:r>
-              <w:rPr>
-                <w:rtl w:val="0"/>
-              </w:rPr>
-            </w:r>
-          </w:p>
-          <w:p>
-            <w:pPr>
-              <w:rPr/>
-            </w:pPr>
-            <w:r>
-              <w:rPr>
-                <w:rtl w:val="0"/>
-              </w:rPr>
-            </w:r>
-          </w:p>
-        </w:tc>
-        <w:tc>
-          <w:tcPr/>
-          <w:p>
-            <w:pPr>
-              <w:rPr/>
-            </w:pPr>
-            <w:r>
-              <w:rPr>
-                <w:rtl w:val="0"/>
-              </w:rPr>
-            </w:r>
-          </w:p>
-        </w:tc>
-        <w:tc>
-          <w:tcPr/>
-          <w:p>
-            <w:pPr>
-              <w:rPr/>
-            </w:pPr>
-            <w:r>
-              <w:rPr>
-                <w:rtl w:val="0"/>
-              </w:rPr>
-            </w:r>
-          </w:p>
-        </w:tc>
-      </w:tr>
-      <w:tr>
-        <w:trPr>
-          <w:cantSplit w:val="0"/>
-          <w:tblHeader w:val="0"/>
-        </w:trPr>
-        <w:tc>
-          <w:tcPr/>
-          <w:p>
-            <w:pPr>
-              <w:rPr/>
-            </w:pPr>
-            <w:r>
-              <w:rPr>
-                <w:rtl w:val="0"/>
-              </w:rPr>
-            </w:r>
-          </w:p>
-          <w:p>
-            <w:pPr>
-              <w:rPr/>
-            </w:pPr>
-            <w:r>
-              <w:rPr>
-                <w:rtl w:val="0"/>
-              </w:rPr>
-            </w:r>
-          </w:p>
-        </w:tc>
-        <w:tc>
-          <w:tcPr/>
-          <w:p>
-            <w:pPr>
-              <w:rPr/>
-            </w:pPr>
-            <w:r>
-              <w:rPr>
-                <w:rtl w:val="0"/>
-              </w:rPr>
-            </w:r>
-          </w:p>
-        </w:tc>
-        <w:tc>
-          <w:tcPr/>
-          <w:p>
-            <w:pPr>
-              <w:rPr/>
-            </w:pPr>
-            <w:r>
-              <w:rPr>
-                <w:rtl w:val="0"/>
-              </w:rPr>
+              <w:t xml:space="preserve">HCS-004</w:t>
+            </w:r>
+          </w:p>
+          <w:p>
+            <w:pPr>
+              <w:rPr/>
+            </w:pPr>
+            <w:r>
+              <w:rPr>
+                <w:rtl w:val="0"/>
+              </w:rPr>
+            </w:r>
+          </w:p>
+        </w:tc>
+        <w:tc>
+          <w:tcPr/>
+          <w:p>
+            <w:pPr>
+              <w:rPr/>
+            </w:pPr>
+            <w:r>
+              <w:rPr>
+                <w:rtl w:val="0"/>
+              </w:rPr>
+              <w:t xml:space="preserve">Como un usuario en proceso de diseño necesito descargar información del proyecto de vivienda con la finalidad de tener un respaldo físico o digital</w:t>
+            </w:r>
+          </w:p>
+        </w:tc>
+        <w:tc>
+          <w:tcPr/>
+          <w:p>
+            <w:pPr>
+              <w:rPr/>
+            </w:pPr>
+            <w:r>
+              <w:rPr>
+                <w:rtl w:val="0"/>
+              </w:rPr>
+              <w:t xml:space="preserve">2 semanas</w:t>
             </w:r>
           </w:p>
         </w:tc>
@@ -3066,43 +3035,54 @@
     </w:p>
     <w:p>
       <w:pPr>
-        <w:rPr/>
+        <w:keepNext w:val="1"/>
+        <w:keepLines w:val="1"/>
+        <w:pageBreakBefore w:val="0"/>
+        <w:widowControl w:val="1"/>
+        <w:pBdr>
+          <w:top w:space="0" w:sz="0" w:val="nil"/>
+          <w:left w:space="0" w:sz="0" w:val="nil"/>
+          <w:bottom w:space="0" w:sz="0" w:val="nil"/>
+          <w:right w:space="0" w:sz="0" w:val="nil"/>
+          <w:between w:space="0" w:sz="0" w:val="nil"/>
+        </w:pBdr>
+        <w:shd w:fill="auto" w:val="clear"/>
+        <w:spacing w:after="0" w:before="200" w:line="276" w:lineRule="auto"/>
+        <w:ind w:left="0" w:right="0" w:firstLine="0"/>
+        <w:jc w:val="left"/>
+        <w:rPr>
+          <w:rFonts w:ascii="Cambria" w:cs="Cambria" w:eastAsia="Cambria" w:hAnsi="Cambria"/>
+          <w:b w:val="1"/>
+          <w:bCs w:val="1"/>
+          <w:i w:val="0"/>
+          <w:iCs w:val="0"/>
+          <w:smallCaps w:val="0"/>
+          <w:strike w:val="0"/>
+          <w:color w:val="4f81bd"/>
+          <w:sz w:val="26"/>
+          <w:szCs w:val="26"/>
+          <w:u w:val="none"/>
+          <w:shd w:fill="auto" w:val="clear"/>
+          <w:vertAlign w:val="baseline"/>
+        </w:rPr>
       </w:pPr>
-      <w:r>
-        <w:rPr>
-          <w:rtl w:val="0"/>
-        </w:rPr>
-      </w:r>
-    </w:p>
-    <w:p>
-      <w:pPr>
-        <w:rPr/>
-      </w:pPr>
-      <w:r>
-        <w:rPr>
-          <w:rtl w:val="0"/>
-        </w:rPr>
-      </w:r>
-    </w:p>
-    <w:p>
-      <w:pPr>
-        <w:rPr/>
-      </w:pPr>
-      <w:r>
-        <w:rPr>
-          <w:rtl w:val="0"/>
-        </w:rPr>
-      </w:r>
-    </w:p>
-    <w:p>
-      <w:pPr>
-        <w:pStyle w:val="Heading2"/>
-        <w:rPr/>
-      </w:pPr>
-      <w:bookmarkStart w:colFirst="0" w:colLast="0" w:name="_heading=h.1t3h5sf" w:id="8"/>
-      <w:bookmarkEnd w:id="8"/>
-      <w:r>
-        <w:rPr>
+      <w:bookmarkStart w:colFirst="0" w:colLast="0" w:name="_heading=h.1t3h5sf" w:id="7"/>
+      <w:bookmarkEnd w:id="7"/>
+      <w:r>
+        <w:rPr>
+          <w:rFonts w:ascii="Cambria" w:cs="Cambria" w:eastAsia="Cambria" w:hAnsi="Cambria"/>
+          <w:b w:val="1"/>
+          <w:bCs w:val="1"/>
+          <w:i w:val="0"/>
+          <w:iCs w:val="0"/>
+          <w:smallCaps w:val="0"/>
+          <w:strike w:val="0"/>
+          <w:color w:val="4f81bd"/>
+          <w:sz w:val="26"/>
+          <w:szCs w:val="26"/>
+          <w:u w:val="none"/>
+          <w:shd w:fill="auto" w:val="clear"/>
+          <w:vertAlign w:val="baseline"/>
           <w:rtl w:val="0"/>
         </w:rPr>
         <w:t xml:space="preserve">Patrón de comparación </w:t>
@@ -3113,7 +3093,6 @@
         <w:tblStyle w:val="Table5"/>
         <w:tblW w:w="8828.0" w:type="dxa"/>
         <w:jc w:val="left"/>
-        <w:tblInd w:w="0.0" w:type="dxa"/>
         <w:tblBorders>
           <w:top w:color="000000" w:space="0" w:sz="4" w:val="single"/>
           <w:left w:color="000000" w:space="0" w:sz="4" w:val="single"/>
@@ -3161,128 +3140,59 @@
               </w:rPr>
             </w:r>
           </w:p>
-          <w:p>
-            <w:pPr>
-              <w:rPr/>
-            </w:pPr>
-            <w:r>
-              <w:rPr>
-                <w:rtl w:val="0"/>
-              </w:rPr>
-            </w:r>
-          </w:p>
-          <w:p>
-            <w:pPr>
-              <w:rPr/>
-            </w:pPr>
-            <w:r>
-              <w:rPr>
-                <w:rtl w:val="0"/>
-              </w:rPr>
-            </w:r>
-          </w:p>
-          <w:p>
-            <w:pPr>
-              <w:rPr/>
-            </w:pPr>
-            <w:r>
-              <w:rPr>
-                <w:rtl w:val="0"/>
-              </w:rPr>
-            </w:r>
-          </w:p>
-          <w:p>
-            <w:pPr>
-              <w:rPr/>
-            </w:pPr>
-            <w:r>
-              <w:rPr>
-                <w:rtl w:val="0"/>
-              </w:rPr>
-            </w:r>
-          </w:p>
-          <w:p>
-            <w:pPr>
-              <w:rPr/>
-            </w:pPr>
-            <w:r>
-              <w:rPr>
-                <w:rtl w:val="0"/>
-              </w:rPr>
-            </w:r>
-          </w:p>
-          <w:p>
-            <w:pPr>
-              <w:rPr/>
-            </w:pPr>
-            <w:r>
-              <w:rPr>
-                <w:rtl w:val="0"/>
-              </w:rPr>
-            </w:r>
-          </w:p>
         </w:tc>
       </w:tr>
     </w:tbl>
     <w:p>
       <w:pPr>
-        <w:rPr/>
+        <w:keepNext w:val="1"/>
+        <w:keepLines w:val="1"/>
+        <w:pageBreakBefore w:val="0"/>
+        <w:widowControl w:val="1"/>
+        <w:pBdr>
+          <w:top w:space="0" w:sz="0" w:val="nil"/>
+          <w:left w:space="0" w:sz="0" w:val="nil"/>
+          <w:bottom w:space="0" w:sz="0" w:val="nil"/>
+          <w:right w:space="0" w:sz="0" w:val="nil"/>
+          <w:between w:space="0" w:sz="0" w:val="nil"/>
+        </w:pBdr>
+        <w:shd w:fill="auto" w:val="clear"/>
+        <w:spacing w:after="0" w:before="480" w:line="276" w:lineRule="auto"/>
+        <w:ind w:left="0" w:right="0" w:firstLine="0"/>
+        <w:jc w:val="left"/>
+        <w:rPr>
+          <w:rFonts w:ascii="Cambria" w:cs="Cambria" w:eastAsia="Cambria" w:hAnsi="Cambria"/>
+          <w:b w:val="1"/>
+          <w:bCs w:val="1"/>
+          <w:i w:val="0"/>
+          <w:iCs w:val="0"/>
+          <w:smallCaps w:val="0"/>
+          <w:strike w:val="0"/>
+          <w:color w:val="366091"/>
+          <w:sz w:val="28"/>
+          <w:szCs w:val="28"/>
+          <w:u w:val="none"/>
+          <w:shd w:fill="auto" w:val="clear"/>
+          <w:vertAlign w:val="baseline"/>
+        </w:rPr>
       </w:pPr>
-      <w:r>
-        <w:rPr>
-          <w:rtl w:val="0"/>
-        </w:rPr>
-      </w:r>
-    </w:p>
-    <w:p>
-      <w:pPr>
-        <w:rPr/>
-      </w:pPr>
-      <w:r>
-        <w:rPr>
-          <w:rtl w:val="0"/>
-        </w:rPr>
-      </w:r>
-    </w:p>
-    <w:p>
-      <w:pPr>
-        <w:rPr/>
-      </w:pPr>
-      <w:r>
-        <w:rPr>
-          <w:rtl w:val="0"/>
-        </w:rPr>
-      </w:r>
-    </w:p>
-    <w:p>
-      <w:pPr>
-        <w:rPr/>
-      </w:pPr>
-      <w:r>
-        <w:rPr>
-          <w:rtl w:val="0"/>
-        </w:rPr>
-      </w:r>
-    </w:p>
-    <w:p>
-      <w:pPr>
-        <w:rPr/>
-      </w:pPr>
-      <w:r>
-        <w:rPr>
-          <w:rtl w:val="0"/>
-        </w:rPr>
-      </w:r>
-    </w:p>
-    <w:p>
-      <w:pPr>
-        <w:pStyle w:val="Heading1"/>
-        <w:rPr/>
-      </w:pPr>
-      <w:bookmarkStart w:colFirst="0" w:colLast="0" w:name="_heading=h.4d34og8" w:id="9"/>
-      <w:bookmarkEnd w:id="9"/>
-      <w:r>
-        <w:rPr>
+      <w:bookmarkStart w:colFirst="0" w:colLast="0" w:name="_heading=h.4d34og8" w:id="8"/>
+      <w:bookmarkEnd w:id="8"/>
+      <w:r>
+        <w:rPr>
+          <w:rFonts w:ascii="Cambria" w:cs="Cambria" w:eastAsia="Cambria" w:hAnsi="Cambria"/>
+          <w:b w:val="1"/>
+          <w:bCs w:val="1"/>
+          <w:i w:val="0"/>
+          <w:iCs w:val="0"/>
+          <w:smallCaps w:val="0"/>
+          <w:strike w:val="0"/>
+          <w:color w:val="366091"/>
+          <w:sz w:val="28"/>
+          <w:szCs w:val="28"/>
+          <w:u w:val="none"/>
+          <w:shd w:fill="auto" w:val="clear"/>
+          <w:vertAlign w:val="baseline"/>
           <w:rtl w:val="0"/>
         </w:rPr>
         <w:t xml:space="preserve">Comprometer historias de Usuario</w:t>
@@ -3304,7 +3214,6 @@
         <w:tblStyle w:val="Table6"/>
         <w:tblW w:w="8828.0" w:type="dxa"/>
         <w:jc w:val="left"/>
-        <w:tblInd w:w="0.0" w:type="dxa"/>
         <w:tblBorders>
           <w:top w:color="000000" w:space="0" w:sz="4" w:val="single"/>
           <w:left w:color="000000" w:space="0" w:sz="4" w:val="single"/>
@@ -3342,11 +3251,13 @@
               <w:jc w:val="center"/>
               <w:rPr>
                 <w:b w:val="1"/>
+                <w:bCs w:val="1"/>
               </w:rPr>
             </w:pPr>
             <w:r>
               <w:rPr>
                 <w:b w:val="1"/>
+                <w:bCs w:val="1"/>
                 <w:rtl w:val="0"/>
               </w:rPr>
               <w:t xml:space="preserve">ID</w:t>
@@ -3361,11 +3272,13 @@
             <w:pPr>
               <w:rPr>
                 <w:b w:val="1"/>
+                <w:bCs w:val="1"/>
               </w:rPr>
             </w:pPr>
             <w:r>
               <w:rPr>
                 <w:b w:val="1"/>
+                <w:bCs w:val="1"/>
                 <w:rtl w:val="0"/>
               </w:rPr>
               <w:t xml:space="preserve">Historia de Usuario</w:t>
@@ -3380,11 +3293,13 @@
             <w:pPr>
               <w:rPr>
                 <w:b w:val="1"/>
+                <w:bCs w:val="1"/>
               </w:rPr>
             </w:pPr>
             <w:r>
               <w:rPr>
                 <w:b w:val="1"/>
+                <w:bCs w:val="1"/>
                 <w:rtl w:val="0"/>
               </w:rPr>
               <w:t xml:space="preserve">Sprint </w:t>
@@ -3407,29 +3322,21 @@
               <w:rPr>
                 <w:rtl w:val="0"/>
               </w:rPr>
-            </w:r>
-          </w:p>
-          <w:p>
-            <w:pPr>
-              <w:rPr/>
-            </w:pPr>
-            <w:r>
-              <w:rPr>
-                <w:rtl w:val="0"/>
-              </w:rPr>
-            </w:r>
-          </w:p>
-        </w:tc>
-        <w:tc>
-          <w:tcPr/>
-          <w:p>
-            <w:pPr>
-              <w:rPr/>
-            </w:pPr>
-            <w:r>
-              <w:rPr>
-                <w:rtl w:val="0"/>
-              </w:rPr>
+              <w:t xml:space="preserve">HCS-001 </w:t>
+            </w:r>
+          </w:p>
+        </w:tc>
+        <w:tc>
+          <w:tcPr/>
+          <w:p>
+            <w:pPr>
+              <w:rPr/>
+            </w:pPr>
+            <w:r>
+              <w:rPr>
+                <w:rtl w:val="0"/>
+              </w:rPr>
+              <w:t xml:space="preserve">Ingreso de presupuesto y generación de sugerencias acordes </w:t>
             </w:r>
           </w:p>
         </w:tc>
@@ -3463,29 +3370,31 @@
               <w:rPr>
                 <w:rtl w:val="0"/>
               </w:rPr>
-            </w:r>
-          </w:p>
-          <w:p>
-            <w:pPr>
-              <w:rPr/>
-            </w:pPr>
-            <w:r>
-              <w:rPr>
-                <w:rtl w:val="0"/>
-              </w:rPr>
-            </w:r>
-          </w:p>
-        </w:tc>
-        <w:tc>
-          <w:tcPr/>
-          <w:p>
-            <w:pPr>
-              <w:rPr/>
-            </w:pPr>
-            <w:r>
-              <w:rPr>
-                <w:rtl w:val="0"/>
-              </w:rPr>
+              <w:t xml:space="preserve">HCS-02</w:t>
+            </w:r>
+          </w:p>
+          <w:p>
+            <w:pPr>
+              <w:rPr/>
+            </w:pPr>
+            <w:r>
+              <w:rPr>
+                <w:rtl w:val="0"/>
+              </w:rPr>
+            </w:r>
+          </w:p>
+        </w:tc>
+        <w:tc>
+          <w:tcPr/>
+          <w:p>
+            <w:pPr>
+              <w:rPr/>
+            </w:pPr>
+            <w:r>
+              <w:rPr>
+                <w:rtl w:val="0"/>
+              </w:rPr>
+              <w:t xml:space="preserve">Configuración de módulos de vivienda y cálculo de presupuesto </w:t>
             </w:r>
           </w:p>
         </w:tc>
@@ -3519,29 +3428,31 @@
               <w:rPr>
                 <w:rtl w:val="0"/>
               </w:rPr>
-            </w:r>
-          </w:p>
-          <w:p>
-            <w:pPr>
-              <w:rPr/>
-            </w:pPr>
-            <w:r>
-              <w:rPr>
-                <w:rtl w:val="0"/>
-              </w:rPr>
-            </w:r>
-          </w:p>
-        </w:tc>
-        <w:tc>
-          <w:tcPr/>
-          <w:p>
-            <w:pPr>
-              <w:rPr/>
-            </w:pPr>
-            <w:r>
-              <w:rPr>
-                <w:rtl w:val="0"/>
-              </w:rPr>
+              <w:t xml:space="preserve">HCS-03</w:t>
+            </w:r>
+          </w:p>
+          <w:p>
+            <w:pPr>
+              <w:rPr/>
+            </w:pPr>
+            <w:r>
+              <w:rPr>
+                <w:rtl w:val="0"/>
+              </w:rPr>
+            </w:r>
+          </w:p>
+        </w:tc>
+        <w:tc>
+          <w:tcPr/>
+          <w:p>
+            <w:pPr>
+              <w:rPr/>
+            </w:pPr>
+            <w:r>
+              <w:rPr>
+                <w:rtl w:val="0"/>
+              </w:rPr>
+              <w:t xml:space="preserve">Desglose detallado de materiales y precios unitarios </w:t>
             </w:r>
           </w:p>
         </w:tc>
@@ -3575,29 +3486,31 @@
               <w:rPr>
                 <w:rtl w:val="0"/>
               </w:rPr>
-            </w:r>
-          </w:p>
-          <w:p>
-            <w:pPr>
-              <w:rPr/>
-            </w:pPr>
-            <w:r>
-              <w:rPr>
-                <w:rtl w:val="0"/>
-              </w:rPr>
-            </w:r>
-          </w:p>
-        </w:tc>
-        <w:tc>
-          <w:tcPr/>
-          <w:p>
-            <w:pPr>
-              <w:rPr/>
-            </w:pPr>
-            <w:r>
-              <w:rPr>
-                <w:rtl w:val="0"/>
-              </w:rPr>
+              <w:t xml:space="preserve">HCS-04</w:t>
+            </w:r>
+          </w:p>
+          <w:p>
+            <w:pPr>
+              <w:rPr/>
+            </w:pPr>
+            <w:r>
+              <w:rPr>
+                <w:rtl w:val="0"/>
+              </w:rPr>
+            </w:r>
+          </w:p>
+        </w:tc>
+        <w:tc>
+          <w:tcPr/>
+          <w:p>
+            <w:pPr>
+              <w:rPr/>
+            </w:pPr>
+            <w:r>
+              <w:rPr>
+                <w:rtl w:val="0"/>
+              </w:rPr>
+              <w:t xml:space="preserve">Descarga y exportación de información del proyecto </w:t>
             </w:r>
           </w:p>
         </w:tc>
@@ -3631,29 +3544,31 @@
               <w:rPr>
                 <w:rtl w:val="0"/>
               </w:rPr>
-            </w:r>
-          </w:p>
-          <w:p>
-            <w:pPr>
-              <w:rPr/>
-            </w:pPr>
-            <w:r>
-              <w:rPr>
-                <w:rtl w:val="0"/>
-              </w:rPr>
-            </w:r>
-          </w:p>
-        </w:tc>
-        <w:tc>
-          <w:tcPr/>
-          <w:p>
-            <w:pPr>
-              <w:rPr/>
-            </w:pPr>
-            <w:r>
-              <w:rPr>
-                <w:rtl w:val="0"/>
-              </w:rPr>
+              <w:t xml:space="preserve">S1-DOC01 </w:t>
+            </w:r>
+          </w:p>
+          <w:p>
+            <w:pPr>
+              <w:rPr/>
+            </w:pPr>
+            <w:r>
+              <w:rPr>
+                <w:rtl w:val="0"/>
+              </w:rPr>
+            </w:r>
+          </w:p>
+        </w:tc>
+        <w:tc>
+          <w:tcPr/>
+          <w:p>
+            <w:pPr>
+              <w:rPr/>
+            </w:pPr>
+            <w:r>
+              <w:rPr>
+                <w:rtl w:val="0"/>
+              </w:rPr>
+              <w:t xml:space="preserve">Levantamiento de requerimientos iniciales </w:t>
             </w:r>
           </w:p>
         </w:tc>
@@ -3687,29 +3602,31 @@
               <w:rPr>
                 <w:rtl w:val="0"/>
               </w:rPr>
-            </w:r>
-          </w:p>
-          <w:p>
-            <w:pPr>
-              <w:rPr/>
-            </w:pPr>
-            <w:r>
-              <w:rPr>
-                <w:rtl w:val="0"/>
-              </w:rPr>
-            </w:r>
-          </w:p>
-        </w:tc>
-        <w:tc>
-          <w:tcPr/>
-          <w:p>
-            <w:pPr>
-              <w:rPr/>
-            </w:pPr>
-            <w:r>
-              <w:rPr>
-                <w:rtl w:val="0"/>
-              </w:rPr>
+              <w:t xml:space="preserve">S1-DOC02</w:t>
+            </w:r>
+          </w:p>
+          <w:p>
+            <w:pPr>
+              <w:rPr/>
+            </w:pPr>
+            <w:r>
+              <w:rPr>
+                <w:rtl w:val="0"/>
+              </w:rPr>
+            </w:r>
+          </w:p>
+        </w:tc>
+        <w:tc>
+          <w:tcPr/>
+          <w:p>
+            <w:pPr>
+              <w:rPr/>
+            </w:pPr>
+            <w:r>
+              <w:rPr>
+                <w:rtl w:val="0"/>
+              </w:rPr>
+              <w:t xml:space="preserve">Autoevaluaciones, visión del proyecto y definición de roles </w:t>
             </w:r>
           </w:p>
         </w:tc>
@@ -3743,29 +3660,31 @@
               <w:rPr>
                 <w:rtl w:val="0"/>
               </w:rPr>
-            </w:r>
-          </w:p>
-          <w:p>
-            <w:pPr>
-              <w:rPr/>
-            </w:pPr>
-            <w:r>
-              <w:rPr>
-                <w:rtl w:val="0"/>
-              </w:rPr>
-            </w:r>
-          </w:p>
-        </w:tc>
-        <w:tc>
-          <w:tcPr/>
-          <w:p>
-            <w:pPr>
-              <w:rPr/>
-            </w:pPr>
-            <w:r>
-              <w:rPr>
-                <w:rtl w:val="0"/>
-              </w:rPr>
+              <w:t xml:space="preserve">S1-DOC03</w:t>
+            </w:r>
+          </w:p>
+          <w:p>
+            <w:pPr>
+              <w:rPr/>
+            </w:pPr>
+            <w:r>
+              <w:rPr>
+                <w:rtl w:val="0"/>
+              </w:rPr>
+            </w:r>
+          </w:p>
+        </w:tc>
+        <w:tc>
+          <w:tcPr/>
+          <w:p>
+            <w:pPr>
+              <w:rPr/>
+            </w:pPr>
+            <w:r>
+              <w:rPr>
+                <w:rtl w:val="0"/>
+              </w:rPr>
+              <w:t xml:space="preserve">Documentación de épicas, historias de usuario, Sprint y Product Backlog </w:t>
             </w:r>
           </w:p>
         </w:tc>
@@ -3797,13 +3716,54 @@
     </w:p>
     <w:p>
       <w:pPr>
-        <w:pStyle w:val="Heading1"/>
-        <w:rPr/>
+        <w:keepNext w:val="1"/>
+        <w:keepLines w:val="1"/>
+        <w:pageBreakBefore w:val="0"/>
+        <w:widowControl w:val="1"/>
+        <w:pBdr>
+          <w:top w:space="0" w:sz="0" w:val="nil"/>
+          <w:left w:space="0" w:sz="0" w:val="nil"/>
+          <w:bottom w:space="0" w:sz="0" w:val="nil"/>
+          <w:right w:space="0" w:sz="0" w:val="nil"/>
+          <w:between w:space="0" w:sz="0" w:val="nil"/>
+        </w:pBdr>
+        <w:shd w:fill="auto" w:val="clear"/>
+        <w:spacing w:after="0" w:before="480" w:line="276" w:lineRule="auto"/>
+        <w:ind w:left="0" w:right="0" w:firstLine="0"/>
+        <w:jc w:val="left"/>
+        <w:rPr>
+          <w:rFonts w:ascii="Cambria" w:cs="Cambria" w:eastAsia="Cambria" w:hAnsi="Cambria"/>
+          <w:b w:val="1"/>
+          <w:bCs w:val="1"/>
+          <w:i w:val="0"/>
+          <w:iCs w:val="0"/>
+          <w:smallCaps w:val="0"/>
+          <w:strike w:val="0"/>
+          <w:color w:val="366091"/>
+          <w:sz w:val="28"/>
+          <w:szCs w:val="28"/>
+          <w:u w:val="none"/>
+          <w:shd w:fill="auto" w:val="clear"/>
+          <w:vertAlign w:val="baseline"/>
+        </w:rPr>
       </w:pPr>
-      <w:bookmarkStart w:colFirst="0" w:colLast="0" w:name="_heading=h.2s8eyo1" w:id="10"/>
-      <w:bookmarkEnd w:id="10"/>
-      <w:r>
-        <w:rPr>
+      <w:bookmarkStart w:colFirst="0" w:colLast="0" w:name="_heading=h.2s8eyo1" w:id="9"/>
+      <w:bookmarkEnd w:id="9"/>
+      <w:r>
+        <w:rPr>
+          <w:rFonts w:ascii="Cambria" w:cs="Cambria" w:eastAsia="Cambria" w:hAnsi="Cambria"/>
+          <w:b w:val="1"/>
+          <w:bCs w:val="1"/>
+          <w:i w:val="0"/>
+          <w:iCs w:val="0"/>
+          <w:smallCaps w:val="0"/>
+          <w:strike w:val="0"/>
+          <w:color w:val="366091"/>
+          <w:sz w:val="28"/>
+          <w:szCs w:val="28"/>
+          <w:u w:val="none"/>
+          <w:shd w:fill="auto" w:val="clear"/>
+          <w:vertAlign w:val="baseline"/>
           <w:rtl w:val="0"/>
         </w:rPr>
         <w:t xml:space="preserve">Definición y estimación de tareas</w:t>
@@ -3825,7 +3785,6 @@
         <w:tblStyle w:val="Table7"/>
         <w:tblW w:w="8828.0" w:type="dxa"/>
         <w:jc w:val="left"/>
-        <w:tblInd w:w="0.0" w:type="dxa"/>
         <w:tblBorders>
           <w:top w:color="000000" w:space="0" w:sz="4" w:val="single"/>
           <w:left w:color="000000" w:space="0" w:sz="4" w:val="single"/>
@@ -3865,11 +3824,13 @@
               <w:jc w:val="center"/>
               <w:rPr>
                 <w:b w:val="1"/>
+                <w:bCs w:val="1"/>
               </w:rPr>
             </w:pPr>
             <w:r>
               <w:rPr>
                 <w:b w:val="1"/>
+                <w:bCs w:val="1"/>
                 <w:rtl w:val="0"/>
               </w:rPr>
               <w:t xml:space="preserve">ID Historia</w:t>
@@ -3884,11 +3845,13 @@
             <w:pPr>
               <w:rPr>
                 <w:b w:val="1"/>
+                <w:bCs w:val="1"/>
               </w:rPr>
             </w:pPr>
             <w:r>
               <w:rPr>
                 <w:b w:val="1"/>
+                <w:bCs w:val="1"/>
                 <w:rtl w:val="0"/>
               </w:rPr>
               <w:t xml:space="preserve">Id Tarea</w:t>
@@ -3903,11 +3866,13 @@
             <w:pPr>
               <w:rPr>
                 <w:b w:val="1"/>
+                <w:bCs w:val="1"/>
               </w:rPr>
             </w:pPr>
             <w:r>
               <w:rPr>
                 <w:b w:val="1"/>
+                <w:bCs w:val="1"/>
                 <w:rtl w:val="0"/>
               </w:rPr>
               <w:t xml:space="preserve">Tarea o Actividad</w:t>
@@ -3922,11 +3887,13 @@
             <w:pPr>
               <w:rPr>
                 <w:b w:val="1"/>
+                <w:bCs w:val="1"/>
               </w:rPr>
             </w:pPr>
             <w:r>
               <w:rPr>
                 <w:b w:val="1"/>
+                <w:bCs w:val="1"/>
                 <w:rtl w:val="0"/>
               </w:rPr>
               <w:t xml:space="preserve">Estimación en Horas</w:t>
@@ -3949,7 +3916,7 @@
               <w:rPr>
                 <w:rtl w:val="0"/>
               </w:rPr>
-              <w:t xml:space="preserve">H1</w:t>
+              <w:t xml:space="preserve">HCS-001 </w:t>
             </w:r>
           </w:p>
           <w:p>
@@ -3987,20 +3954,21 @@
               <w:rPr>
                 <w:rtl w:val="0"/>
               </w:rPr>
-            </w:r>
-          </w:p>
-        </w:tc>
-        <w:tc>
-          <w:tcPr/>
-          <w:p>
-            <w:pPr>
-              <w:rPr/>
-            </w:pPr>
-            <w:r>
-              <w:rPr>
-                <w:rtl w:val="0"/>
-              </w:rPr>
-              <w:t xml:space="preserve">0</w:t>
+              <w:t xml:space="preserve">Levantamiento de requerimientos </w:t>
+            </w:r>
+          </w:p>
+        </w:tc>
+        <w:tc>
+          <w:tcPr/>
+          <w:p>
+            <w:pPr>
+              <w:rPr/>
+            </w:pPr>
+            <w:r>
+              <w:rPr>
+                <w:rtl w:val="0"/>
+              </w:rPr>
+              <w:t xml:space="preserve">17</w:t>
             </w:r>
           </w:p>
         </w:tc>
@@ -4020,7 +3988,7 @@
               <w:rPr>
                 <w:rtl w:val="0"/>
               </w:rPr>
-              <w:t xml:space="preserve">H1</w:t>
+              <w:t xml:space="preserve">HCS-001 </w:t>
             </w:r>
           </w:p>
           <w:p>
@@ -4058,20 +4026,21 @@
               <w:rPr>
                 <w:rtl w:val="0"/>
               </w:rPr>
-            </w:r>
-          </w:p>
-        </w:tc>
-        <w:tc>
-          <w:tcPr/>
-          <w:p>
-            <w:pPr>
-              <w:rPr/>
-            </w:pPr>
-            <w:r>
-              <w:rPr>
-                <w:rtl w:val="0"/>
-              </w:rPr>
-              <w:t xml:space="preserve">0</w:t>
+              <w:t xml:space="preserve">Desarrollo Doc: 2.1 autorevaluaciones </w:t>
+            </w:r>
+          </w:p>
+        </w:tc>
+        <w:tc>
+          <w:tcPr/>
+          <w:p>
+            <w:pPr>
+              <w:rPr/>
+            </w:pPr>
+            <w:r>
+              <w:rPr>
+                <w:rtl w:val="0"/>
+              </w:rPr>
+              <w:t xml:space="preserve">3</w:t>
             </w:r>
           </w:p>
         </w:tc>
@@ -4091,7 +4060,7 @@
               <w:rPr>
                 <w:rtl w:val="0"/>
               </w:rPr>
-              <w:t xml:space="preserve">H1</w:t>
+              <w:t xml:space="preserve">HCS-001 </w:t>
             </w:r>
           </w:p>
           <w:p>
@@ -4129,20 +4098,21 @@
               <w:rPr>
                 <w:rtl w:val="0"/>
               </w:rPr>
-            </w:r>
-          </w:p>
-        </w:tc>
-        <w:tc>
-          <w:tcPr/>
-          <w:p>
-            <w:pPr>
-              <w:rPr/>
-            </w:pPr>
-            <w:r>
-              <w:rPr>
-                <w:rtl w:val="0"/>
-              </w:rPr>
-              <w:t xml:space="preserve">0</w:t>
+              <w:t xml:space="preserve">Desarrollo Doc: Definición de visión y roles </w:t>
+            </w:r>
+          </w:p>
+        </w:tc>
+        <w:tc>
+          <w:tcPr/>
+          <w:p>
+            <w:pPr>
+              <w:rPr/>
+            </w:pPr>
+            <w:r>
+              <w:rPr>
+                <w:rtl w:val="0"/>
+              </w:rPr>
+              <w:t xml:space="preserve">2</w:t>
             </w:r>
           </w:p>
         </w:tc>
@@ -4162,7 +4132,7 @@
               <w:rPr>
                 <w:rtl w:val="0"/>
               </w:rPr>
-              <w:t xml:space="preserve">H2</w:t>
+              <w:t xml:space="preserve">HCS-002 </w:t>
             </w:r>
           </w:p>
           <w:p>
@@ -4200,20 +4170,21 @@
               <w:rPr>
                 <w:rtl w:val="0"/>
               </w:rPr>
-            </w:r>
-          </w:p>
-        </w:tc>
-        <w:tc>
-          <w:tcPr/>
-          <w:p>
-            <w:pPr>
-              <w:rPr/>
-            </w:pPr>
-            <w:r>
-              <w:rPr>
-                <w:rtl w:val="0"/>
-              </w:rPr>
-              <w:t xml:space="preserve">0</w:t>
+              <w:t xml:space="preserve">Desarrollo Doc: Documentación épicas e historias de usuarios</w:t>
+            </w:r>
+          </w:p>
+        </w:tc>
+        <w:tc>
+          <w:tcPr/>
+          <w:p>
+            <w:pPr>
+              <w:rPr/>
+            </w:pPr>
+            <w:r>
+              <w:rPr>
+                <w:rtl w:val="0"/>
+              </w:rPr>
+              <w:t xml:space="preserve">3</w:t>
             </w:r>
           </w:p>
         </w:tc>
@@ -4233,7 +4204,7 @@
               <w:rPr>
                 <w:rtl w:val="0"/>
               </w:rPr>
-              <w:t xml:space="preserve">H2</w:t>
+              <w:t xml:space="preserve">HCS-002 </w:t>
             </w:r>
           </w:p>
           <w:p>
@@ -4271,20 +4242,21 @@
               <w:rPr>
                 <w:rtl w:val="0"/>
               </w:rPr>
-            </w:r>
-          </w:p>
-        </w:tc>
-        <w:tc>
-          <w:tcPr/>
-          <w:p>
-            <w:pPr>
-              <w:rPr/>
-            </w:pPr>
-            <w:r>
-              <w:rPr>
-                <w:rtl w:val="0"/>
-              </w:rPr>
-              <w:t xml:space="preserve">0</w:t>
+              <w:t xml:space="preserve">Desarrollo Doc: Documentación Sprint y Product Backlog </w:t>
+            </w:r>
+          </w:p>
+        </w:tc>
+        <w:tc>
+          <w:tcPr/>
+          <w:p>
+            <w:pPr>
+              <w:rPr/>
+            </w:pPr>
+            <w:r>
+              <w:rPr>
+                <w:rtl w:val="0"/>
+              </w:rPr>
+              <w:t xml:space="preserve">3</w:t>
             </w:r>
           </w:p>
         </w:tc>
@@ -4304,7 +4276,7 @@
               <w:rPr>
                 <w:rtl w:val="0"/>
               </w:rPr>
-              <w:t xml:space="preserve">H2</w:t>
+              <w:t xml:space="preserve">HCS-003 </w:t>
             </w:r>
           </w:p>
           <w:p>
@@ -4342,20 +4314,21 @@
               <w:rPr>
                 <w:rtl w:val="0"/>
               </w:rPr>
-            </w:r>
-          </w:p>
-        </w:tc>
-        <w:tc>
-          <w:tcPr/>
-          <w:p>
-            <w:pPr>
-              <w:rPr/>
-            </w:pPr>
-            <w:r>
-              <w:rPr>
-                <w:rtl w:val="0"/>
-              </w:rPr>
-              <w:t xml:space="preserve">0</w:t>
+              <w:t xml:space="preserve">Desarrollo Doc: Plantilla historias de usuarios </w:t>
+            </w:r>
+          </w:p>
+        </w:tc>
+        <w:tc>
+          <w:tcPr/>
+          <w:p>
+            <w:pPr>
+              <w:rPr/>
+            </w:pPr>
+            <w:r>
+              <w:rPr>
+                <w:rtl w:val="0"/>
+              </w:rPr>
+              <w:t xml:space="preserve">3</w:t>
             </w:r>
           </w:p>
         </w:tc>
@@ -4375,55 +4348,48 @@
               <w:rPr>
                 <w:rtl w:val="0"/>
               </w:rPr>
-            </w:r>
-          </w:p>
-          <w:p>
-            <w:pPr>
-              <w:rPr/>
-            </w:pPr>
-            <w:r>
-              <w:rPr>
-                <w:rtl w:val="0"/>
-              </w:rPr>
-            </w:r>
-          </w:p>
-        </w:tc>
-        <w:tc>
-          <w:tcPr/>
-          <w:p>
-            <w:pPr>
-              <w:rPr/>
-            </w:pPr>
-            <w:r>
-              <w:rPr>
-                <w:rtl w:val="0"/>
-              </w:rPr>
-            </w:r>
-          </w:p>
-        </w:tc>
-        <w:tc>
-          <w:tcPr/>
-          <w:p>
-            <w:pPr>
-              <w:rPr/>
-            </w:pPr>
-            <w:r>
-              <w:rPr>
-                <w:rtl w:val="0"/>
-              </w:rPr>
-            </w:r>
-          </w:p>
-        </w:tc>
-        <w:tc>
-          <w:tcPr/>
-          <w:p>
-            <w:pPr>
-              <w:rPr/>
-            </w:pPr>
-            <w:r>
-              <w:rPr>
-                <w:rtl w:val="0"/>
-              </w:rPr>
+              <w:t xml:space="preserve">HCS-004 </w:t>
+            </w:r>
+          </w:p>
+        </w:tc>
+        <w:tc>
+          <w:tcPr/>
+          <w:p>
+            <w:pPr>
+              <w:rPr/>
+            </w:pPr>
+            <w:r>
+              <w:rPr>
+                <w:rtl w:val="0"/>
+              </w:rPr>
+            </w:r>
+          </w:p>
+        </w:tc>
+        <w:tc>
+          <w:tcPr/>
+          <w:p>
+            <w:pPr>
+              <w:rPr/>
+            </w:pPr>
+            <w:r>
+              <w:rPr>
+                <w:rtl w:val="0"/>
+              </w:rPr>
+              <w:t xml:space="preserve">Desarrollo Doc: Reunión retrospectiva 1 </w:t>
+            </w:r>
+          </w:p>
+        </w:tc>
+        <w:tc>
+          <w:tcPr/>
+          <w:p>
+            <w:pPr>
+              <w:rPr/>
+            </w:pPr>
+            <w:r>
+              <w:rPr>
+                <w:rtl w:val="0"/>
+              </w:rPr>
+              <w:t xml:space="preserve">1</w:t>
             </w:r>
           </w:p>
         </w:tc>
@@ -4431,8 +4397,44 @@
     </w:tbl>
     <w:p>
       <w:pPr>
+        <w:keepNext w:val="1"/>
+        <w:keepLines w:val="1"/>
+        <w:pageBreakBefore w:val="0"/>
+        <w:widowControl w:val="1"/>
+        <w:pBdr>
+          <w:top w:space="0" w:sz="0" w:val="nil"/>
+          <w:left w:space="0" w:sz="0" w:val="nil"/>
+          <w:bottom w:space="0" w:sz="0" w:val="nil"/>
+          <w:right w:space="0" w:sz="0" w:val="nil"/>
+          <w:between w:space="0" w:sz="0" w:val="nil"/>
+        </w:pBdr>
+        <w:shd w:fill="auto" w:val="clear"/>
+        <w:spacing w:after="0" w:before="480" w:line="276" w:lineRule="auto"/>
+        <w:ind w:left="0" w:right="0" w:firstLine="0"/>
+        <w:jc w:val="left"/>
         <w:rPr/>
       </w:pPr>
+      <w:bookmarkStart w:colFirst="0" w:colLast="0" w:name="_heading=h.17dp8vu" w:id="10"/>
+      <w:bookmarkEnd w:id="10"/>
+      <w:r>
+        <w:rPr>
+          <w:rFonts w:ascii="Cambria" w:cs="Cambria" w:eastAsia="Cambria" w:hAnsi="Cambria"/>
+          <w:b w:val="1"/>
+          <w:bCs w:val="1"/>
+          <w:i w:val="0"/>
+          <w:iCs w:val="0"/>
+          <w:smallCaps w:val="0"/>
+          <w:strike w:val="0"/>
+          <w:color w:val="366091"/>
+          <w:sz w:val="28"/>
+          <w:szCs w:val="28"/>
+          <w:u w:val="none"/>
+          <w:shd w:fill="auto" w:val="clear"/>
+          <w:vertAlign w:val="baseline"/>
+          <w:rtl w:val="0"/>
+        </w:rPr>
+        <w:t xml:space="preserve">Gráfico Burndown Chart inicial del Sprint 1</w:t>
+      </w:r>
       <w:r>
         <w:rPr>
           <w:rtl w:val="0"/>
@@ -4444,68 +4446,12 @@
         <w:rPr/>
       </w:pPr>
       <w:r>
-        <w:rPr>
-          <w:rtl w:val="0"/>
-        </w:rPr>
-      </w:r>
-    </w:p>
-    <w:p>
-      <w:pPr>
-        <w:rPr/>
-      </w:pPr>
-      <w:r>
-        <w:rPr>
-          <w:rtl w:val="0"/>
-        </w:rPr>
-      </w:r>
-    </w:p>
-    <w:p>
-      <w:pPr>
-        <w:pStyle w:val="Heading1"/>
-        <w:rPr/>
-      </w:pPr>
-      <w:bookmarkStart w:colFirst="0" w:colLast="0" w:name="_heading=h.17dp8vu" w:id="11"/>
-      <w:bookmarkEnd w:id="11"/>
-      <w:r>
-        <w:rPr>
-          <w:rtl w:val="0"/>
-        </w:rPr>
-        <w:t xml:space="preserve">Gráfico Burndown Chart inicial del Sprint 1</w:t>
-      </w:r>
-    </w:p>
-    <w:p>
-      <w:pPr>
-        <w:rPr/>
-      </w:pPr>
-      <w:r>
-        <w:rPr>
-          <w:rtl w:val="0"/>
-        </w:rPr>
-        <w:t xml:space="preserve">El Scrum Master define el siguiente gráfico inicial del primer Sprint, el gráfico sólo debe contener las tareas definidas para el primer Sprint mostrando el total de horas definidas, pero sin avance aún en las tareas.</w:t>
-      </w:r>
-    </w:p>
-    <w:p>
-      <w:pPr>
-        <w:rPr/>
-      </w:pPr>
-      <w:r>
-        <w:rPr>
-          <w:rtl w:val="0"/>
-        </w:rPr>
-        <w:t xml:space="preserve">Por ejemplo:</w:t>
-      </w:r>
-    </w:p>
-    <w:p>
-      <w:pPr>
-        <w:rPr/>
-      </w:pPr>
-      <w:r>
         <w:rPr/>
         <w:drawing>
-          <wp:inline distB="0" distT="0" distL="0" distR="0">
-            <wp:extent cx="5608320" cy="2133600"/>
-            <wp:effectExtent b="0" l="0" r="0" t="0"/>
-            <wp:docPr id="6" name="image2.png"/>
+          <wp:inline distB="114300" distT="114300" distL="114300" distR="114300">
+            <wp:extent cx="5612130" cy="1981200"/>
+            <wp:effectExtent b="12700" l="12700" r="12700" t="12700"/>
+            <wp:docPr id="8" name="image2.png"/>
             <a:graphic>
               <a:graphicData uri="http://schemas.openxmlformats.org/drawingml/2006/picture">
                 <pic:pic>
@@ -4514,7 +4460,7 @@
                     <pic:cNvPicPr preferRelativeResize="0"/>
                   </pic:nvPicPr>
                   <pic:blipFill>
-                    <a:blip r:embed="rId7"/>
+                    <a:blip r:embed="rId10"/>
                     <a:srcRect b="0" l="0" r="0" t="0"/>
                     <a:stretch>
                       <a:fillRect/>
@@ -4523,10 +4469,15 @@
                   <pic:spPr>
                     <a:xfrm>
                       <a:off x="0" y="0"/>
-                      <a:ext cx="5608320" cy="2133600"/>
+                      <a:ext cx="5612130" cy="1981200"/>
                     </a:xfrm>
                     <a:prstGeom prst="rect"/>
-                    <a:ln/>
+                    <a:ln w="12700">
+                      <a:solidFill>
+                        <a:srgbClr val="000000"/>
+                      </a:solidFill>
+                      <a:prstDash val="solid"/>
+                    </a:ln>
                   </pic:spPr>
                 </pic:pic>
               </a:graphicData>
@@ -4540,49 +4491,9 @@
         </w:rPr>
       </w:r>
     </w:p>
-    <w:p>
-      <w:pPr>
-        <w:rPr/>
-      </w:pPr>
-      <w:r>
-        <w:rPr>
-          <w:rtl w:val="0"/>
-        </w:rPr>
-      </w:r>
-    </w:p>
-    <w:p>
-      <w:pPr>
-        <w:rPr/>
-      </w:pPr>
-      <w:r>
-        <w:rPr>
-          <w:rtl w:val="0"/>
-        </w:rPr>
-      </w:r>
-    </w:p>
-    <w:p>
-      <w:pPr>
-        <w:rPr/>
-      </w:pPr>
-      <w:r>
-        <w:rPr>
-          <w:rtl w:val="0"/>
-        </w:rPr>
-      </w:r>
-    </w:p>
-    <w:p>
-      <w:pPr>
-        <w:rPr/>
-      </w:pPr>
-      <w:r>
-        <w:rPr>
-          <w:rtl w:val="0"/>
-        </w:rPr>
-      </w:r>
-    </w:p>
     <w:sectPr>
-      <w:headerReference r:id="rId8" w:type="default"/>
-      <w:footerReference r:id="rId9" w:type="default"/>
+      <w:headerReference r:id="rId11" w:type="default"/>
+      <w:footerReference r:id="rId12" w:type="default"/>
       <w:pgSz w:h="15840" w:w="12240" w:orient="portrait"/>
       <w:pgMar w:bottom="1418" w:top="1418" w:left="1701" w:right="1701" w:header="709" w:footer="709"/>
       <w:pgNumType w:start="1"/>
@@ -4592,12 +4503,11 @@
 </file>
 
 <file path=word/footer1.xml><?xml version="1.0" encoding="utf-8"?>
-<w:ftr xmlns:mc="http://schemas.openxmlformats.org/markup-compatibility/2006" xmlns:o="urn:schemas-microsoft-com:office:office" xmlns:r="http://schemas.openxmlformats.org/officeDocument/2006/relationships" xmlns:m="http://schemas.openxmlformats.org/officeDocument/2006/math" xmlns:v="urn:schemas-microsoft-com:vml" xmlns:wp="http://schemas.openxmlformats.org/drawingml/2006/wordprocessingDrawing" xmlns:w10="urn:schemas-microsoft-com:office:word" xmlns:w="http://schemas.openxmlformats.org/wordprocessingml/2006/main" xmlns:wne="http://schemas.microsoft.com/office/word/2006/wordml" xmlns:sl="http://schemas.openxmlformats.org/schemaLibrary/2006/main" xmlns:a="http://schemas.openxmlformats.org/drawingml/2006/main" xmlns:pic="http://schemas.openxmlformats.org/drawingml/2006/picture" xmlns:c="http://schemas.openxmlformats.org/drawingml/2006/chart" xmlns:lc="http://schemas.openxmlformats.org/drawingml/2006/lockedCanvas" xmlns:dgm="http://schemas.openxmlformats.org/drawingml/2006/diagram" xmlns:wps="http://schemas.microsoft.com/office/word/2010/wordprocessingShape" xmlns:wpg="http://schemas.microsoft.com/office/word/2010/wordprocessingGroup" xmlns:w14="http://schemas.microsoft.com/office/word/2010/wordml" xmlns:w15="http://schemas.microsoft.com/office/word/2012/wordml">
+<w:ftr xmlns:mc="http://schemas.openxmlformats.org/markup-compatibility/2006" xmlns:o="urn:schemas-microsoft-com:office:office" xmlns:r="http://schemas.openxmlformats.org/officeDocument/2006/relationships" xmlns:m="http://schemas.openxmlformats.org/officeDocument/2006/math" xmlns:v="urn:schemas-microsoft-com:vml" xmlns:wp="http://schemas.openxmlformats.org/drawingml/2006/wordprocessingDrawing" xmlns:w10="urn:schemas-microsoft-com:office:word" xmlns:w="http://schemas.openxmlformats.org/wordprocessingml/2006/main" xmlns:wne="http://schemas.microsoft.com/office/word/2006/wordml" xmlns:sl="http://schemas.openxmlformats.org/schemaLibrary/2006/main" xmlns:a="http://schemas.openxmlformats.org/drawingml/2006/main" xmlns:pic="http://schemas.openxmlformats.org/drawingml/2006/picture" xmlns:c="http://schemas.openxmlformats.org/drawingml/2006/chart" xmlns:lc="http://schemas.openxmlformats.org/drawingml/2006/lockedCanvas" xmlns:dgm="http://schemas.openxmlformats.org/drawingml/2006/diagram" xmlns:wps="http://schemas.microsoft.com/office/word/2010/wordprocessingShape" xmlns:wpg="http://schemas.microsoft.com/office/word/2010/wordprocessingGroup" xmlns:w14="http://schemas.microsoft.com/office/word/2010/wordml" xmlns:w15="http://schemas.microsoft.com/office/word/2012/wordml" xmlns:w16="http://schemas.microsoft.com/office/word/2018/wordml" xmlns:w16cex="http://schemas.microsoft.com/office/word/2018/wordml/cex" xmlns:w16cid="http://schemas.microsoft.com/office/word/2016/wordml/cid" xmlns="http://schemas.microsoft.com/office/tasks/2019/documenttasks" xmlns:cr="http://schemas.microsoft.com/office/comments/2020/reactions">
   <w:p>
     <w:pPr>
       <w:keepNext w:val="0"/>
       <w:keepLines w:val="0"/>
-      <w:pageBreakBefore w:val="0"/>
       <w:widowControl w:val="1"/>
       <w:pBdr>
         <w:top w:space="0" w:sz="0" w:val="nil"/>
@@ -4608,8 +4518,8 @@
       </w:pBdr>
       <w:shd w:fill="auto" w:val="clear"/>
       <w:tabs>
-        <w:tab w:val="center" w:pos="4419"/>
-        <w:tab w:val="right" w:pos="8838"/>
+        <w:tab w:val="center" w:leader="none" w:pos="4419"/>
+        <w:tab w:val="right" w:leader="none" w:pos="8838"/>
       </w:tabs>
       <w:spacing w:after="0" w:before="0" w:line="240" w:lineRule="auto"/>
       <w:ind w:left="0" w:right="0" w:firstLine="0"/>
@@ -4617,7 +4527,9 @@
       <w:rPr>
         <w:rFonts w:ascii="Calibri" w:cs="Calibri" w:eastAsia="Calibri" w:hAnsi="Calibri"/>
         <w:b w:val="0"/>
+        <w:bCs w:val="0"/>
         <w:i w:val="0"/>
+        <w:iCs w:val="0"/>
         <w:smallCaps w:val="0"/>
         <w:strike w:val="0"/>
         <w:color w:val="000000"/>
@@ -4632,7 +4544,9 @@
       <w:rPr>
         <w:rFonts w:ascii="Calibri" w:cs="Calibri" w:eastAsia="Calibri" w:hAnsi="Calibri"/>
         <w:b w:val="0"/>
+        <w:bCs w:val="0"/>
         <w:i w:val="0"/>
+        <w:iCs w:val="0"/>
         <w:smallCaps w:val="0"/>
         <w:strike w:val="0"/>
         <w:color w:val="000000"/>
@@ -4649,7 +4563,9 @@
       <w:rPr>
         <w:rFonts w:ascii="Calibri" w:cs="Calibri" w:eastAsia="Calibri" w:hAnsi="Calibri"/>
         <w:b w:val="0"/>
+        <w:bCs w:val="0"/>
         <w:i w:val="0"/>
+        <w:iCs w:val="0"/>
         <w:smallCaps w:val="0"/>
         <w:strike w:val="0"/>
         <w:color w:val="000000"/>
@@ -4667,7 +4583,6 @@
     <w:pPr>
       <w:keepNext w:val="0"/>
       <w:keepLines w:val="0"/>
-      <w:pageBreakBefore w:val="0"/>
       <w:widowControl w:val="1"/>
       <w:pBdr>
         <w:top w:space="0" w:sz="0" w:val="nil"/>
@@ -4678,8 +4593,8 @@
       </w:pBdr>
       <w:shd w:fill="auto" w:val="clear"/>
       <w:tabs>
-        <w:tab w:val="center" w:pos="4419"/>
-        <w:tab w:val="right" w:pos="8838"/>
+        <w:tab w:val="center" w:leader="none" w:pos="4419"/>
+        <w:tab w:val="right" w:leader="none" w:pos="8838"/>
       </w:tabs>
       <w:spacing w:after="0" w:before="0" w:line="240" w:lineRule="auto"/>
       <w:ind w:left="0" w:right="0" w:firstLine="0"/>
@@ -4687,7 +4602,9 @@
       <w:rPr>
         <w:rFonts w:ascii="Calibri" w:cs="Calibri" w:eastAsia="Calibri" w:hAnsi="Calibri"/>
         <w:b w:val="0"/>
+        <w:bCs w:val="0"/>
         <w:i w:val="0"/>
+        <w:iCs w:val="0"/>
         <w:smallCaps w:val="0"/>
         <w:strike w:val="0"/>
         <w:color w:val="000000"/>
@@ -4708,15 +4625,15 @@
 </file>
 
 <file path=word/header1.xml><?xml version="1.0" encoding="utf-8"?>
-<w:hdr xmlns:mc="http://schemas.openxmlformats.org/markup-compatibility/2006" xmlns:o="urn:schemas-microsoft-com:office:office" xmlns:r="http://schemas.openxmlformats.org/officeDocument/2006/relationships" xmlns:m="http://schemas.openxmlformats.org/officeDocument/2006/math" xmlns:v="urn:schemas-microsoft-com:vml" xmlns:wp="http://schemas.openxmlformats.org/drawingml/2006/wordprocessingDrawing" xmlns:w10="urn:schemas-microsoft-com:office:word" xmlns:w="http://schemas.openxmlformats.org/wordprocessingml/2006/main" xmlns:wne="http://schemas.microsoft.com/office/word/2006/wordml" xmlns:sl="http://schemas.openxmlformats.org/schemaLibrary/2006/main" xmlns:a="http://schemas.openxmlformats.org/drawingml/2006/main" xmlns:pic="http://schemas.openxmlformats.org/drawingml/2006/picture" xmlns:c="http://schemas.openxmlformats.org/drawingml/2006/chart" xmlns:lc="http://schemas.openxmlformats.org/drawingml/2006/lockedCanvas" xmlns:dgm="http://schemas.openxmlformats.org/drawingml/2006/diagram" xmlns:wps="http://schemas.microsoft.com/office/word/2010/wordprocessingShape" xmlns:wpg="http://schemas.microsoft.com/office/word/2010/wordprocessingGroup" xmlns:w14="http://schemas.microsoft.com/office/word/2010/wordml" xmlns:w15="http://schemas.microsoft.com/office/word/2012/wordml">
+<w:hdr xmlns:mc="http://schemas.openxmlformats.org/markup-compatibility/2006" xmlns:o="urn:schemas-microsoft-com:office:office" xmlns:r="http://schemas.openxmlformats.org/officeDocument/2006/relationships" xmlns:m="http://schemas.openxmlformats.org/officeDocument/2006/math" xmlns:v="urn:schemas-microsoft-com:vml" xmlns:wp="http://schemas.openxmlformats.org/drawingml/2006/wordprocessingDrawing" xmlns:w10="urn:schemas-microsoft-com:office:word" xmlns:w="http://schemas.openxmlformats.org/wordprocessingml/2006/main" xmlns:wne="http://schemas.microsoft.com/office/word/2006/wordml" xmlns:sl="http://schemas.openxmlformats.org/schemaLibrary/2006/main" xmlns:a="http://schemas.openxmlformats.org/drawingml/2006/main" xmlns:pic="http://schemas.openxmlformats.org/drawingml/2006/picture" xmlns:c="http://schemas.openxmlformats.org/drawingml/2006/chart" xmlns:lc="http://schemas.openxmlformats.org/drawingml/2006/lockedCanvas" xmlns:dgm="http://schemas.openxmlformats.org/drawingml/2006/diagram" xmlns:wps="http://schemas.microsoft.com/office/word/2010/wordprocessingShape" xmlns:wpg="http://schemas.microsoft.com/office/word/2010/wordprocessingGroup" xmlns:w14="http://schemas.microsoft.com/office/word/2010/wordml" xmlns:w15="http://schemas.microsoft.com/office/word/2012/wordml" xmlns:w16="http://schemas.microsoft.com/office/word/2018/wordml" xmlns:w16cex="http://schemas.microsoft.com/office/word/2018/wordml/cex" xmlns:w16cid="http://schemas.microsoft.com/office/word/2016/wordml/cid" xmlns="http://schemas.microsoft.com/office/tasks/2019/documenttasks" xmlns:cr="http://schemas.microsoft.com/office/comments/2020/reactions">
   <w:p>
     <w:pPr>
       <w:pBdr>
         <w:bottom w:color="000000" w:space="1" w:sz="4" w:val="single"/>
       </w:pBdr>
       <w:tabs>
-        <w:tab w:val="center" w:pos="4419"/>
-        <w:tab w:val="right" w:pos="8838"/>
+        <w:tab w:val="center" w:leader="none" w:pos="4419"/>
+        <w:tab w:val="right" w:leader="none" w:pos="8838"/>
       </w:tabs>
       <w:spacing w:after="0" w:line="240" w:lineRule="auto"/>
       <w:jc w:val="right"/>
@@ -4739,12 +4656,12 @@
             <wp:posOffset>131977</wp:posOffset>
           </wp:positionH>
           <wp:positionV relativeFrom="paragraph">
-            <wp:posOffset>-152561</wp:posOffset>
+            <wp:posOffset>-152560</wp:posOffset>
           </wp:positionV>
           <wp:extent cx="932815" cy="231775"/>
           <wp:effectExtent b="0" l="0" r="0" t="0"/>
           <wp:wrapSquare wrapText="bothSides" distB="0" distT="0" distL="114300" distR="114300"/>
-          <wp:docPr id="5" name="image1.png"/>
+          <wp:docPr id="7" name="image1.png"/>
           <a:graphic>
             <a:graphicData uri="http://schemas.openxmlformats.org/drawingml/2006/picture">
               <pic:pic>
@@ -4778,11 +4695,11 @@
 </file>
 
 <file path=word/numbering.xml><?xml version="1.0" encoding="utf-8"?>
-<w:numbering xmlns:mc="http://schemas.openxmlformats.org/markup-compatibility/2006" xmlns:o="urn:schemas-microsoft-com:office:office" xmlns:r="http://schemas.openxmlformats.org/officeDocument/2006/relationships" xmlns:m="http://schemas.openxmlformats.org/officeDocument/2006/math" xmlns:v="urn:schemas-microsoft-com:vml" xmlns:wp="http://schemas.openxmlformats.org/drawingml/2006/wordprocessingDrawing" xmlns:w10="urn:schemas-microsoft-com:office:word" xmlns:w="http://schemas.openxmlformats.org/wordprocessingml/2006/main" xmlns:wne="http://schemas.microsoft.com/office/word/2006/wordml" xmlns:sl="http://schemas.openxmlformats.org/schemaLibrary/2006/main" xmlns:a="http://schemas.openxmlformats.org/drawingml/2006/main" xmlns:pic="http://schemas.openxmlformats.org/drawingml/2006/picture" xmlns:c="http://schemas.openxmlformats.org/drawingml/2006/chart" xmlns:lc="http://schemas.openxmlformats.org/drawingml/2006/lockedCanvas" xmlns:dgm="http://schemas.openxmlformats.org/drawingml/2006/diagram" xmlns:wps="http://schemas.microsoft.com/office/word/2010/wordprocessingShape" xmlns:wpg="http://schemas.microsoft.com/office/word/2010/wordprocessingGroup" xmlns:w14="http://schemas.microsoft.com/office/word/2010/wordml" xmlns:w15="http://schemas.microsoft.com/office/word/2012/wordml"/>
+<w:numbering xmlns:mc="http://schemas.openxmlformats.org/markup-compatibility/2006" xmlns:o="urn:schemas-microsoft-com:office:office" xmlns:r="http://schemas.openxmlformats.org/officeDocument/2006/relationships" xmlns:m="http://schemas.openxmlformats.org/officeDocument/2006/math" xmlns:v="urn:schemas-microsoft-com:vml" xmlns:wp="http://schemas.openxmlformats.org/drawingml/2006/wordprocessingDrawing" xmlns:w10="urn:schemas-microsoft-com:office:word" xmlns:w="http://schemas.openxmlformats.org/wordprocessingml/2006/main" xmlns:wne="http://schemas.microsoft.com/office/word/2006/wordml" xmlns:sl="http://schemas.openxmlformats.org/schemaLibrary/2006/main" xmlns:a="http://schemas.openxmlformats.org/drawingml/2006/main" xmlns:pic="http://schemas.openxmlformats.org/drawingml/2006/picture" xmlns:c="http://schemas.openxmlformats.org/drawingml/2006/chart" xmlns:lc="http://schemas.openxmlformats.org/drawingml/2006/lockedCanvas" xmlns:dgm="http://schemas.openxmlformats.org/drawingml/2006/diagram" xmlns:wps="http://schemas.microsoft.com/office/word/2010/wordprocessingShape" xmlns:wpg="http://schemas.microsoft.com/office/word/2010/wordprocessingGroup" xmlns:w14="http://schemas.microsoft.com/office/word/2010/wordml" xmlns:w15="http://schemas.microsoft.com/office/word/2012/wordml" xmlns:w16="http://schemas.microsoft.com/office/word/2018/wordml" xmlns:w16cex="http://schemas.microsoft.com/office/word/2018/wordml/cex" xmlns:w16cid="http://schemas.microsoft.com/office/word/2016/wordml/cid" xmlns="http://schemas.microsoft.com/office/tasks/2019/documenttasks" xmlns:cr="http://schemas.microsoft.com/office/comments/2020/reactions"/>
 </file>
 
 <file path=word/styles.xml><?xml version="1.0" encoding="utf-8"?>
-<w:styles xmlns:mc="http://schemas.openxmlformats.org/markup-compatibility/2006" xmlns:o="urn:schemas-microsoft-com:office:office" xmlns:r="http://schemas.openxmlformats.org/officeDocument/2006/relationships" xmlns:m="http://schemas.openxmlformats.org/officeDocument/2006/math" xmlns:v="urn:schemas-microsoft-com:vml" xmlns:wp="http://schemas.openxmlformats.org/drawingml/2006/wordprocessingDrawing" xmlns:w10="urn:schemas-microsoft-com:office:word" xmlns:w="http://schemas.openxmlformats.org/wordprocessingml/2006/main" xmlns:wne="http://schemas.microsoft.com/office/word/2006/wordml" xmlns:sl="http://schemas.openxmlformats.org/schemaLibrary/2006/main" xmlns:a="http://schemas.openxmlformats.org/drawingml/2006/main" xmlns:pic="http://schemas.openxmlformats.org/drawingml/2006/picture" xmlns:c="http://schemas.openxmlformats.org/drawingml/2006/chart" xmlns:lc="http://schemas.openxmlformats.org/drawingml/2006/lockedCanvas" xmlns:dgm="http://schemas.openxmlformats.org/drawingml/2006/diagram" xmlns:wps="http://schemas.microsoft.com/office/word/2010/wordprocessingShape" xmlns:wpg="http://schemas.microsoft.com/office/word/2010/wordprocessingGroup" xmlns:w14="http://schemas.microsoft.com/office/word/2010/wordml" xmlns:w15="http://schemas.microsoft.com/office/word/2012/wordml">
+<w:styles xmlns:mc="http://schemas.openxmlformats.org/markup-compatibility/2006" xmlns:o="urn:schemas-microsoft-com:office:office" xmlns:r="http://schemas.openxmlformats.org/officeDocument/2006/relationships" xmlns:m="http://schemas.openxmlformats.org/officeDocument/2006/math" xmlns:v="urn:schemas-microsoft-com:vml" xmlns:wp="http://schemas.openxmlformats.org/drawingml/2006/wordprocessingDrawing" xmlns:w10="urn:schemas-microsoft-com:office:word" xmlns:w="http://schemas.openxmlformats.org/wordprocessingml/2006/main" xmlns:wne="http://schemas.microsoft.com/office/word/2006/wordml" xmlns:sl="http://schemas.openxmlformats.org/schemaLibrary/2006/main" xmlns:a="http://schemas.openxmlformats.org/drawingml/2006/main" xmlns:pic="http://schemas.openxmlformats.org/drawingml/2006/picture" xmlns:c="http://schemas.openxmlformats.org/drawingml/2006/chart" xmlns:lc="http://schemas.openxmlformats.org/drawingml/2006/lockedCanvas" xmlns:dgm="http://schemas.openxmlformats.org/drawingml/2006/diagram" xmlns:wps="http://schemas.microsoft.com/office/word/2010/wordprocessingShape" xmlns:wpg="http://schemas.microsoft.com/office/word/2010/wordprocessingGroup" xmlns:w14="http://schemas.microsoft.com/office/word/2010/wordml" xmlns:w15="http://schemas.microsoft.com/office/word/2012/wordml" xmlns:w16="http://schemas.microsoft.com/office/word/2018/wordml" xmlns:w16cex="http://schemas.microsoft.com/office/word/2018/wordml/cex" xmlns:w16cid="http://schemas.microsoft.com/office/word/2016/wordml/cid" xmlns="http://schemas.microsoft.com/office/tasks/2019/documenttasks" xmlns:cr="http://schemas.microsoft.com/office/comments/2020/reactions">
   <w:docDefaults>
     <w:rPrDefault>
       <w:rPr>
@@ -4798,11 +4715,19 @@
       </w:pPr>
     </w:pPrDefault>
   </w:docDefaults>
+  <w:style w:type="table" w:styleId="TableNormal" w:default="1">
+    <w:name w:val="TableNormal"/>
+    <w:tblPr>
+      <w:tblCellMar>
+        <w:top w:w="100.0" w:type="dxa"/>
+        <w:left w:w="100.0" w:type="dxa"/>
+        <w:bottom w:w="100.0" w:type="dxa"/>
+        <w:right w:w="100.0" w:type="dxa"/>
+      </w:tblCellMar>
+    </w:tblPr>
+  </w:style>
   <w:style w:type="paragraph" w:styleId="Normal" w:default="1">
     <w:name w:val="normal"/>
-  </w:style>
-  <w:style w:type="table" w:styleId="TableNormal" w:default="1">
-    <w:name w:val="Table Normal"/>
   </w:style>
   <w:style w:type="paragraph" w:styleId="Heading1">
     <w:name w:val="heading 1"/>
@@ -4816,6 +4741,7 @@
     <w:rPr>
       <w:rFonts w:ascii="Cambria" w:cs="Cambria" w:eastAsia="Cambria" w:hAnsi="Cambria"/>
       <w:b w:val="1"/>
+      <w:bCs w:val="1"/>
       <w:color w:val="366091"/>
       <w:sz w:val="28"/>
       <w:szCs w:val="28"/>
@@ -4833,6 +4759,7 @@
     <w:rPr>
       <w:rFonts w:ascii="Cambria" w:cs="Cambria" w:eastAsia="Cambria" w:hAnsi="Cambria"/>
       <w:b w:val="1"/>
+      <w:bCs w:val="1"/>
       <w:color w:val="4f81bd"/>
       <w:sz w:val="26"/>
       <w:szCs w:val="26"/>
@@ -4852,7 +4779,9 @@
     <w:rPr>
       <w:rFonts w:ascii="Arial" w:cs="Arial" w:eastAsia="Arial" w:hAnsi="Arial"/>
       <w:b w:val="0"/>
+      <w:bCs w:val="0"/>
       <w:i w:val="1"/>
+      <w:iCs w:val="1"/>
       <w:color w:val="000000"/>
       <w:sz w:val="20"/>
       <w:szCs w:val="20"/>
@@ -4872,6 +4801,7 @@
     <w:rPr>
       <w:rFonts w:ascii="Arial" w:cs="Arial" w:eastAsia="Arial" w:hAnsi="Arial"/>
       <w:b w:val="0"/>
+      <w:bCs w:val="0"/>
       <w:color w:val="000000"/>
       <w:sz w:val="20"/>
       <w:szCs w:val="20"/>
@@ -4904,6 +4834,7 @@
     <w:rPr>
       <w:rFonts w:ascii="Verdana" w:cs="Verdana" w:eastAsia="Verdana" w:hAnsi="Verdana"/>
       <w:i w:val="1"/>
+      <w:iCs w:val="1"/>
     </w:rPr>
   </w:style>
   <w:style w:type="paragraph" w:styleId="Title">
@@ -4917,149 +4848,16 @@
     <w:rPr>
       <w:rFonts w:ascii="Arial" w:cs="Arial" w:eastAsia="Arial" w:hAnsi="Arial"/>
       <w:b w:val="1"/>
+      <w:bCs w:val="1"/>
       <w:sz w:val="36"/>
       <w:szCs w:val="36"/>
     </w:rPr>
   </w:style>
   <w:style w:type="paragraph" w:styleId="Normal" w:default="1">
-    <w:name w:val="Normal"/>
-    <w:qFormat w:val="1"/>
-    <w:rsid w:val="002C589F"/>
-  </w:style>
-  <w:style w:type="paragraph" w:styleId="Ttulo1">
-    <w:name w:val="heading 1"/>
-    <w:basedOn w:val="Normal"/>
-    <w:next w:val="Normal"/>
-    <w:link w:val="Ttulo1Car"/>
-    <w:qFormat w:val="1"/>
-    <w:rsid w:val="00616CDB"/>
-    <w:pPr>
-      <w:keepNext w:val="1"/>
-      <w:keepLines w:val="1"/>
-      <w:spacing w:after="0" w:before="480"/>
-      <w:outlineLvl w:val="0"/>
-    </w:pPr>
-    <w:rPr>
-      <w:rFonts w:asciiTheme="majorHAnsi" w:cstheme="majorBidi" w:eastAsiaTheme="majorEastAsia" w:hAnsiTheme="majorHAnsi"/>
-      <w:b w:val="1"/>
-      <w:bCs w:val="1"/>
-      <w:color w:val="365f91" w:themeColor="accent1" w:themeShade="0000BF"/>
-      <w:sz w:val="28"/>
-      <w:szCs w:val="28"/>
-    </w:rPr>
-  </w:style>
-  <w:style w:type="paragraph" w:styleId="Ttulo2">
-    <w:name w:val="heading 2"/>
-    <w:basedOn w:val="Normal"/>
-    <w:next w:val="Normal"/>
-    <w:link w:val="Ttulo2Car"/>
-    <w:unhideWhenUsed w:val="1"/>
-    <w:qFormat w:val="1"/>
-    <w:rsid w:val="00616CDB"/>
-    <w:pPr>
-      <w:keepNext w:val="1"/>
-      <w:keepLines w:val="1"/>
-      <w:spacing w:after="0" w:before="200"/>
-      <w:outlineLvl w:val="1"/>
-    </w:pPr>
-    <w:rPr>
-      <w:rFonts w:asciiTheme="majorHAnsi" w:cstheme="majorBidi" w:eastAsiaTheme="majorEastAsia" w:hAnsiTheme="majorHAnsi"/>
-      <w:b w:val="1"/>
-      <w:bCs w:val="1"/>
-      <w:color w:val="4f81bd" w:themeColor="accent1"/>
-      <w:sz w:val="26"/>
-      <w:szCs w:val="26"/>
-    </w:rPr>
-  </w:style>
-  <w:style w:type="paragraph" w:styleId="Ttulo3">
-    <w:name w:val="heading 3"/>
-    <w:basedOn w:val="Ttulo1"/>
-    <w:next w:val="Normal"/>
-    <w:link w:val="Ttulo3Car"/>
-    <w:qFormat w:val="1"/>
-    <w:rsid w:val="000A2611"/>
-    <w:pPr>
-      <w:keepLines w:val="0"/>
-      <w:widowControl w:val="0"/>
-      <w:spacing w:after="60" w:before="120" w:line="240" w:lineRule="atLeast"/>
-      <w:jc w:val="both"/>
-      <w:outlineLvl w:val="2"/>
-    </w:pPr>
-    <w:rPr>
-      <w:rFonts w:ascii="Arial" w:cs="Times New Roman" w:eastAsia="Times New Roman" w:hAnsi="Arial"/>
-      <w:b w:val="0"/>
-      <w:bCs w:val="0"/>
-      <w:i w:val="1"/>
-      <w:color w:val="auto"/>
-      <w:sz w:val="20"/>
-      <w:szCs w:val="20"/>
-      <w:lang w:val="en-US"/>
-    </w:rPr>
-  </w:style>
-  <w:style w:type="paragraph" w:styleId="Ttulo4">
-    <w:name w:val="heading 4"/>
-    <w:basedOn w:val="Ttulo1"/>
-    <w:next w:val="Normal"/>
-    <w:link w:val="Ttulo4Car"/>
-    <w:qFormat w:val="1"/>
-    <w:rsid w:val="000A2611"/>
-    <w:pPr>
-      <w:keepLines w:val="0"/>
-      <w:widowControl w:val="0"/>
-      <w:spacing w:after="60" w:before="120" w:line="240" w:lineRule="atLeast"/>
-      <w:jc w:val="both"/>
-      <w:outlineLvl w:val="3"/>
-    </w:pPr>
-    <w:rPr>
-      <w:rFonts w:ascii="Arial" w:cs="Times New Roman" w:eastAsia="Times New Roman" w:hAnsi="Arial"/>
-      <w:b w:val="0"/>
-      <w:bCs w:val="0"/>
-      <w:color w:val="auto"/>
-      <w:sz w:val="20"/>
-      <w:szCs w:val="20"/>
-      <w:lang w:val="en-US"/>
-    </w:rPr>
-  </w:style>
-  <w:style w:type="paragraph" w:styleId="Ttulo5">
-    <w:name w:val="heading 5"/>
-    <w:basedOn w:val="Normal"/>
-    <w:next w:val="Normal"/>
-    <w:link w:val="Ttulo5Car"/>
-    <w:qFormat w:val="1"/>
-    <w:rsid w:val="000A2611"/>
-    <w:pPr>
-      <w:widowControl w:val="0"/>
-      <w:spacing w:after="60" w:before="240" w:line="240" w:lineRule="atLeast"/>
-      <w:ind w:left="2880"/>
-      <w:jc w:val="both"/>
-      <w:outlineLvl w:val="4"/>
-    </w:pPr>
-    <w:rPr>
-      <w:rFonts w:ascii="Verdana" w:cs="Times New Roman" w:eastAsia="Times New Roman" w:hAnsi="Verdana"/>
-      <w:szCs w:val="20"/>
-      <w:lang w:val="en-US"/>
-    </w:rPr>
-  </w:style>
-  <w:style w:type="paragraph" w:styleId="Ttulo6">
-    <w:name w:val="heading 6"/>
-    <w:basedOn w:val="Normal"/>
-    <w:next w:val="Normal"/>
-    <w:link w:val="Ttulo6Car"/>
-    <w:qFormat w:val="1"/>
-    <w:rsid w:val="000A2611"/>
-    <w:pPr>
-      <w:widowControl w:val="0"/>
-      <w:spacing w:after="60" w:before="240" w:line="240" w:lineRule="atLeast"/>
-      <w:ind w:left="2880"/>
-      <w:jc w:val="both"/>
-      <w:outlineLvl w:val="5"/>
-    </w:pPr>
-    <w:rPr>
-      <w:rFonts w:ascii="Verdana" w:cs="Times New Roman" w:eastAsia="Times New Roman" w:hAnsi="Verdana"/>
-      <w:i w:val="1"/>
-      <w:szCs w:val="20"/>
-      <w:lang w:val="en-US"/>
-    </w:rPr>
+    <w:name w:val="normal"/>
+  </w:style>
+  <w:style w:type="table" w:styleId="TableNormal" w:default="1">
+    <w:name w:val="Table Normal"/>
   </w:style>
   <w:style w:type="paragraph" w:styleId="Ttulo7">
     <w:name w:val="heading 7"/>
@@ -5274,25 +5072,6 @@
       <w:szCs w:val="16"/>
     </w:rPr>
   </w:style>
-  <w:style w:type="paragraph" w:styleId="Ttulo">
-    <w:name w:val="Title"/>
-    <w:basedOn w:val="Normal"/>
-    <w:link w:val="TtuloCar"/>
-    <w:qFormat w:val="1"/>
-    <w:rsid w:val="005F3456"/>
-    <w:pPr>
-      <w:spacing w:after="0" w:line="240" w:lineRule="auto"/>
-      <w:jc w:val="center"/>
-    </w:pPr>
-    <w:rPr>
-      <w:rFonts w:ascii="Arial" w:cs="Arial" w:eastAsia="Times New Roman" w:hAnsi="Arial"/>
-      <w:b w:val="1"/>
-      <w:bCs w:val="1"/>
-      <w:sz w:val="36"/>
-      <w:szCs w:val="36"/>
-      <w:lang w:eastAsia="es-ES" w:val="es-ES"/>
-    </w:rPr>
-  </w:style>
   <w:style w:type="character" w:styleId="TtuloCar" w:customStyle="1">
     <w:name w:val="Título Car"/>
     <w:basedOn w:val="Fuentedeprrafopredeter"/>
@@ -5587,6 +5366,112 @@
       <w:lang w:val="en-US"/>
     </w:rPr>
   </w:style>
+  <w:style w:type="table" w:styleId="Table1">
+    <w:basedOn w:val="TableNormal"/>
+    <w:pPr>
+      <w:spacing w:after="0" w:line="240" w:lineRule="auto"/>
+    </w:pPr>
+    <w:tblPr>
+      <w:tblStyleRowBandSize w:val="1"/>
+      <w:tblStyleColBandSize w:val="1"/>
+      <w:tblCellMar>
+        <w:top w:w="0.0" w:type="dxa"/>
+        <w:left w:w="108.0" w:type="dxa"/>
+        <w:bottom w:w="0.0" w:type="dxa"/>
+        <w:right w:w="108.0" w:type="dxa"/>
+      </w:tblCellMar>
+    </w:tblPr>
+  </w:style>
+  <w:style w:type="table" w:styleId="Table2">
+    <w:basedOn w:val="TableNormal"/>
+    <w:tblPr>
+      <w:tblStyleRowBandSize w:val="1"/>
+      <w:tblStyleColBandSize w:val="1"/>
+      <w:tblCellMar>
+        <w:top w:w="0.0" w:type="dxa"/>
+        <w:left w:w="115.0" w:type="dxa"/>
+        <w:bottom w:w="0.0" w:type="dxa"/>
+        <w:right w:w="115.0" w:type="dxa"/>
+      </w:tblCellMar>
+    </w:tblPr>
+  </w:style>
+  <w:style w:type="table" w:styleId="Table3">
+    <w:basedOn w:val="TableNormal"/>
+    <w:tblPr>
+      <w:tblStyleRowBandSize w:val="1"/>
+      <w:tblStyleColBandSize w:val="1"/>
+      <w:tblCellMar>
+        <w:top w:w="0.0" w:type="dxa"/>
+        <w:left w:w="115.0" w:type="dxa"/>
+        <w:bottom w:w="0.0" w:type="dxa"/>
+        <w:right w:w="115.0" w:type="dxa"/>
+      </w:tblCellMar>
+    </w:tblPr>
+  </w:style>
+  <w:style w:type="table" w:styleId="Table4">
+    <w:basedOn w:val="TableNormal"/>
+    <w:pPr>
+      <w:spacing w:after="0" w:line="240" w:lineRule="auto"/>
+    </w:pPr>
+    <w:tblPr>
+      <w:tblStyleRowBandSize w:val="1"/>
+      <w:tblStyleColBandSize w:val="1"/>
+      <w:tblCellMar>
+        <w:top w:w="0.0" w:type="dxa"/>
+        <w:left w:w="108.0" w:type="dxa"/>
+        <w:bottom w:w="0.0" w:type="dxa"/>
+        <w:right w:w="108.0" w:type="dxa"/>
+      </w:tblCellMar>
+    </w:tblPr>
+  </w:style>
+  <w:style w:type="table" w:styleId="Table5">
+    <w:basedOn w:val="TableNormal"/>
+    <w:pPr>
+      <w:spacing w:after="0" w:line="240" w:lineRule="auto"/>
+    </w:pPr>
+    <w:tblPr>
+      <w:tblStyleRowBandSize w:val="1"/>
+      <w:tblStyleColBandSize w:val="1"/>
+      <w:tblCellMar>
+        <w:top w:w="0.0" w:type="dxa"/>
+        <w:left w:w="108.0" w:type="dxa"/>
+        <w:bottom w:w="0.0" w:type="dxa"/>
+        <w:right w:w="108.0" w:type="dxa"/>
+      </w:tblCellMar>
+    </w:tblPr>
+  </w:style>
+  <w:style w:type="table" w:styleId="Table6">
+    <w:basedOn w:val="TableNormal"/>
+    <w:pPr>
+      <w:spacing w:after="0" w:line="240" w:lineRule="auto"/>
+    </w:pPr>
+    <w:tblPr>
+      <w:tblStyleRowBandSize w:val="1"/>
+      <w:tblStyleColBandSize w:val="1"/>
+      <w:tblCellMar>
+        <w:top w:w="0.0" w:type="dxa"/>
+        <w:left w:w="108.0" w:type="dxa"/>
+        <w:bottom w:w="0.0" w:type="dxa"/>
+        <w:right w:w="108.0" w:type="dxa"/>
+      </w:tblCellMar>
+    </w:tblPr>
+  </w:style>
+  <w:style w:type="table" w:styleId="Table7">
+    <w:basedOn w:val="TableNormal"/>
+    <w:pPr>
+      <w:spacing w:after="0" w:line="240" w:lineRule="auto"/>
+    </w:pPr>
+    <w:tblPr>
+      <w:tblStyleRowBandSize w:val="1"/>
+      <w:tblStyleColBandSize w:val="1"/>
+      <w:tblCellMar>
+        <w:top w:w="0.0" w:type="dxa"/>
+        <w:left w:w="108.0" w:type="dxa"/>
+        <w:bottom w:w="0.0" w:type="dxa"/>
+        <w:right w:w="108.0" w:type="dxa"/>
+      </w:tblCellMar>
+    </w:tblPr>
+  </w:style>
   <w:style w:type="paragraph" w:styleId="Subtitle">
     <w:name w:val="Subtitle"/>
     <w:basedOn w:val="Normal"/>
@@ -5600,6 +5485,7 @@
     <w:rPr>
       <w:rFonts w:ascii="Georgia" w:cs="Georgia" w:eastAsia="Georgia" w:hAnsi="Georgia"/>
       <w:i w:val="1"/>
+      <w:iCs w:val="1"/>
       <w:color w:val="666666"/>
       <w:sz w:val="48"/>
       <w:szCs w:val="48"/>
@@ -6000,8 +5886,8 @@
 </file>
 
 <file path=customXML/item1.xml><?xml version="1.0" encoding="utf-8"?>
-<go:gDocsCustomXmlDataStorage xmlns:go="http://customooxmlschemas.google.com/" xmlns:r="http://schemas.openxmlformats.org/officeDocument/2006/relationships">
-  <go:docsCustomData xmlns:go="http://customooxmlschemas.google.com/" roundtripDataSignature="AMtx7mgtACpWJGtPp44mtwvXbkLBWDMpfA==">AMUW2mXcfJDq/FtJrQYWVbs6khvVpwFXOnMDgBED1H7nSo782yEE58NdEk+7AiJg+Px0keCbKLCCs+ipY/0nLhpD0IyV28chu18F+UpveDZ6Q1rzPaMMqc8pvQmD7BtSdyGhu8l3MibgMpVGPoFqBzJlCWYF1xxr3gALociLqJ6aWfMhtLwyi38ddwUySHZPSyU2ZeHbjsghJDxSYpBg+5VQe8HpzqTEyN0oWQGaWKm4C+vDH8FHaXHuCZHQMwMTq/YOX397XrQuSeskBwy94zImnR1PQv9jDyqgSutJygytUwpfHkoRuhE=</go:docsCustomData>
+<go:gDocsCustomXmlDataStorage xmlns:go="http://customooxmlschemas.google.com/" xmlns:r="http://schemas.openxmlformats.org/officeDocument/2006/relationships" uri="GoogleDocsCustomDataVersion2">
+  <go:docsCustomData xmlns:go="http://customooxmlschemas.google.com/" roundtripDataSignature="AMtx7mjLeypaLwdOBmBihted+josXTX5BA==">CgMxLjAyCGguZ2pkZ3hzMg5oLm96bGs2a2tpczA2dzIJaC4zMGowemxsMgloLjN6bnlzaDcyCWguMmV0OTJwMDIIaC50eWpjd3QyCWguM2R5NnZrbTIJaC4xdDNoNXNmMgloLjRkMzRvZzgyCWguMnM4ZXlvMTIJaC4xN2RwOHZ1OAByITFGVTZYOHZDSTlfY2JDWVBtRFZXSnA1UHpxbVRZTVVZUQ==</go:docsCustomData>
 </go:gDocsCustomXmlDataStorage>
 </file>
 

</xml_diff>